<commit_message>
Modify BRD with actual datasets
</commit_message>
<xml_diff>
--- a/docs/BRD_Enterprise_Sales_Intelligence_Platform v1.1.docx
+++ b/docs/BRD_Enterprise_Sales_Intelligence_Platform v1.1.docx
@@ -89,12 +89,6 @@
         <w:gridCol w:w="3240"/>
       </w:tblGrid>
       <w:tr>
-        <w:tblPrEx>
-          <w:tblCellMar>
-            <w:top w:w="0" w:type="dxa"/>
-            <w:bottom w:w="0" w:type="dxa"/>
-          </w:tblCellMar>
-        </w:tblPrEx>
         <w:trPr>
           <w:jc w:val="center"/>
         </w:trPr>
@@ -158,18 +152,12 @@
                 <w:sz w:val="20"/>
                 <w:szCs w:val="20"/>
               </w:rPr>
-              <w:t>1</w:t>
+              <w:t>2</w:t>
             </w:r>
           </w:p>
         </w:tc>
       </w:tr>
       <w:tr>
-        <w:tblPrEx>
-          <w:tblCellMar>
-            <w:top w:w="0" w:type="dxa"/>
-            <w:bottom w:w="0" w:type="dxa"/>
-          </w:tblCellMar>
-        </w:tblPrEx>
         <w:trPr>
           <w:jc w:val="center"/>
         </w:trPr>
@@ -226,18 +214,26 @@
                 <w:sz w:val="20"/>
                 <w:szCs w:val="20"/>
               </w:rPr>
-              <w:t>Draft — In Review</w:t>
+              <w:t>Signed-off</w:t>
+            </w:r>
+            <w:r>
+              <w:rPr>
+                <w:sz w:val="20"/>
+                <w:szCs w:val="20"/>
+              </w:rPr>
+              <w:t xml:space="preserve"> — </w:t>
+            </w:r>
+            <w:r>
+              <w:rPr>
+                <w:sz w:val="20"/>
+                <w:szCs w:val="20"/>
+              </w:rPr>
+              <w:t>Accepted</w:t>
             </w:r>
           </w:p>
         </w:tc>
       </w:tr>
       <w:tr>
-        <w:tblPrEx>
-          <w:tblCellMar>
-            <w:top w:w="0" w:type="dxa"/>
-            <w:bottom w:w="0" w:type="dxa"/>
-          </w:tblCellMar>
-        </w:tblPrEx>
         <w:trPr>
           <w:jc w:val="center"/>
         </w:trPr>
@@ -300,12 +296,6 @@
         </w:tc>
       </w:tr>
       <w:tr>
-        <w:tblPrEx>
-          <w:tblCellMar>
-            <w:top w:w="0" w:type="dxa"/>
-            <w:bottom w:w="0" w:type="dxa"/>
-          </w:tblCellMar>
-        </w:tblPrEx>
         <w:trPr>
           <w:jc w:val="center"/>
         </w:trPr>
@@ -368,12 +358,6 @@
         </w:tc>
       </w:tr>
       <w:tr>
-        <w:tblPrEx>
-          <w:tblCellMar>
-            <w:top w:w="0" w:type="dxa"/>
-            <w:bottom w:w="0" w:type="dxa"/>
-          </w:tblCellMar>
-        </w:tblPrEx>
         <w:trPr>
           <w:jc w:val="center"/>
         </w:trPr>
@@ -496,12 +480,6 @@
         <w:gridCol w:w="9360"/>
       </w:tblGrid>
       <w:tr>
-        <w:tblPrEx>
-          <w:tblCellMar>
-            <w:top w:w="0" w:type="dxa"/>
-            <w:bottom w:w="0" w:type="dxa"/>
-          </w:tblCellMar>
-        </w:tblPrEx>
         <w:tc>
           <w:tcPr>
             <w:tcW w:w="0" w:type="auto"/>
@@ -574,7 +552,25 @@
         <w:jc w:val="both"/>
       </w:pPr>
       <w:r>
-        <w:t>The organisation currently operates two disconnected source systems — an ERP system managing orders, products, and logistics, and a CRM system managing customer relationships. Key business challenges include:</w:t>
+        <w:t xml:space="preserve">The organisation currently operates two disconnected source systems — an ERP system managing </w:t>
+      </w:r>
+      <w:r>
+        <w:t>customer</w:t>
+      </w:r>
+      <w:r>
+        <w:t xml:space="preserve"> PI</w:t>
+      </w:r>
+      <w:r>
+        <w:t>, location and product category</w:t>
+      </w:r>
+      <w:r>
+        <w:t>, and a CRM system managing customer</w:t>
+      </w:r>
+      <w:r>
+        <w:t>, product and sales details</w:t>
+      </w:r>
+      <w:r>
+        <w:t>. Key business challenges include:</w:t>
       </w:r>
     </w:p>
     <w:p>
@@ -774,12 +770,6 @@
         <w:gridCol w:w="5360"/>
       </w:tblGrid>
       <w:tr>
-        <w:tblPrEx>
-          <w:tblCellMar>
-            <w:top w:w="0" w:type="dxa"/>
-            <w:bottom w:w="0" w:type="dxa"/>
-          </w:tblCellMar>
-        </w:tblPrEx>
         <w:tc>
           <w:tcPr>
             <w:tcW w:w="4000" w:type="dxa"/>
@@ -844,12 +834,6 @@
         </w:tc>
       </w:tr>
       <w:tr>
-        <w:tblPrEx>
-          <w:tblCellMar>
-            <w:top w:w="0" w:type="dxa"/>
-            <w:bottom w:w="0" w:type="dxa"/>
-          </w:tblCellMar>
-        </w:tblPrEx>
         <w:tc>
           <w:tcPr>
             <w:tcW w:w="4000" w:type="dxa"/>
@@ -910,12 +894,6 @@
         </w:tc>
       </w:tr>
       <w:tr>
-        <w:tblPrEx>
-          <w:tblCellMar>
-            <w:top w:w="0" w:type="dxa"/>
-            <w:bottom w:w="0" w:type="dxa"/>
-          </w:tblCellMar>
-        </w:tblPrEx>
         <w:tc>
           <w:tcPr>
             <w:tcW w:w="4000" w:type="dxa"/>
@@ -969,18 +947,28 @@
                 <w:sz w:val="20"/>
                 <w:szCs w:val="20"/>
               </w:rPr>
-              <w:t>Automated ETL pipeline via dbt models + scheduled SQL views</w:t>
+              <w:t xml:space="preserve">Automated ETL pipeline via </w:t>
+            </w:r>
+            <w:proofErr w:type="spellStart"/>
+            <w:r>
+              <w:rPr>
+                <w:sz w:val="20"/>
+                <w:szCs w:val="20"/>
+              </w:rPr>
+              <w:t>dbt</w:t>
+            </w:r>
+            <w:proofErr w:type="spellEnd"/>
+            <w:r>
+              <w:rPr>
+                <w:sz w:val="20"/>
+                <w:szCs w:val="20"/>
+              </w:rPr>
+              <w:t xml:space="preserve"> models + scheduled SQL views</w:t>
             </w:r>
           </w:p>
         </w:tc>
       </w:tr>
       <w:tr>
-        <w:tblPrEx>
-          <w:tblCellMar>
-            <w:top w:w="0" w:type="dxa"/>
-            <w:bottom w:w="0" w:type="dxa"/>
-          </w:tblCellMar>
-        </w:tblPrEx>
         <w:tc>
           <w:tcPr>
             <w:tcW w:w="4000" w:type="dxa"/>
@@ -1040,12 +1028,6 @@
         </w:tc>
       </w:tr>
       <w:tr>
-        <w:tblPrEx>
-          <w:tblCellMar>
-            <w:top w:w="0" w:type="dxa"/>
-            <w:bottom w:w="0" w:type="dxa"/>
-          </w:tblCellMar>
-        </w:tblPrEx>
         <w:tc>
           <w:tcPr>
             <w:tcW w:w="4000" w:type="dxa"/>
@@ -1105,12 +1087,6 @@
         </w:tc>
       </w:tr>
       <w:tr>
-        <w:tblPrEx>
-          <w:tblCellMar>
-            <w:top w:w="0" w:type="dxa"/>
-            <w:bottom w:w="0" w:type="dxa"/>
-          </w:tblCellMar>
-        </w:tblPrEx>
         <w:tc>
           <w:tcPr>
             <w:tcW w:w="4000" w:type="dxa"/>
@@ -1213,12 +1189,6 @@
         <w:gridCol w:w="3160"/>
       </w:tblGrid>
       <w:tr>
-        <w:tblPrEx>
-          <w:tblCellMar>
-            <w:top w:w="0" w:type="dxa"/>
-            <w:bottom w:w="0" w:type="dxa"/>
-          </w:tblCellMar>
-        </w:tblPrEx>
         <w:tc>
           <w:tcPr>
             <w:tcW w:w="2200" w:type="dxa"/>
@@ -1345,12 +1315,6 @@
         </w:tc>
       </w:tr>
       <w:tr>
-        <w:tblPrEx>
-          <w:tblCellMar>
-            <w:top w:w="0" w:type="dxa"/>
-            <w:bottom w:w="0" w:type="dxa"/>
-          </w:tblCellMar>
-        </w:tblPrEx>
         <w:tc>
           <w:tcPr>
             <w:tcW w:w="2200" w:type="dxa"/>
@@ -1467,12 +1431,6 @@
         </w:tc>
       </w:tr>
       <w:tr>
-        <w:tblPrEx>
-          <w:tblCellMar>
-            <w:top w:w="0" w:type="dxa"/>
-            <w:bottom w:w="0" w:type="dxa"/>
-          </w:tblCellMar>
-        </w:tblPrEx>
         <w:tc>
           <w:tcPr>
             <w:tcW w:w="2200" w:type="dxa"/>
@@ -1589,12 +1547,6 @@
         </w:tc>
       </w:tr>
       <w:tr>
-        <w:tblPrEx>
-          <w:tblCellMar>
-            <w:top w:w="0" w:type="dxa"/>
-            <w:bottom w:w="0" w:type="dxa"/>
-          </w:tblCellMar>
-        </w:tblPrEx>
         <w:tc>
           <w:tcPr>
             <w:tcW w:w="2200" w:type="dxa"/>
@@ -1711,12 +1663,6 @@
         </w:tc>
       </w:tr>
       <w:tr>
-        <w:tblPrEx>
-          <w:tblCellMar>
-            <w:top w:w="0" w:type="dxa"/>
-            <w:bottom w:w="0" w:type="dxa"/>
-          </w:tblCellMar>
-        </w:tblPrEx>
         <w:tc>
           <w:tcPr>
             <w:tcW w:w="2200" w:type="dxa"/>
@@ -1833,12 +1779,6 @@
         </w:tc>
       </w:tr>
       <w:tr>
-        <w:tblPrEx>
-          <w:tblCellMar>
-            <w:top w:w="0" w:type="dxa"/>
-            <w:bottom w:w="0" w:type="dxa"/>
-          </w:tblCellMar>
-        </w:tblPrEx>
         <w:tc>
           <w:tcPr>
             <w:tcW w:w="2200" w:type="dxa"/>
@@ -1990,12 +1930,6 @@
         <w:gridCol w:w="6960"/>
       </w:tblGrid>
       <w:tr>
-        <w:tblPrEx>
-          <w:tblCellMar>
-            <w:top w:w="0" w:type="dxa"/>
-            <w:bottom w:w="0" w:type="dxa"/>
-          </w:tblCellMar>
-        </w:tblPrEx>
         <w:tc>
           <w:tcPr>
             <w:tcW w:w="2400" w:type="dxa"/>
@@ -2060,12 +1994,6 @@
         </w:tc>
       </w:tr>
       <w:tr>
-        <w:tblPrEx>
-          <w:tblCellMar>
-            <w:top w:w="0" w:type="dxa"/>
-            <w:bottom w:w="0" w:type="dxa"/>
-          </w:tblCellMar>
-        </w:tblPrEx>
         <w:tc>
           <w:tcPr>
             <w:tcW w:w="2400" w:type="dxa"/>
@@ -2125,12 +2053,6 @@
         </w:tc>
       </w:tr>
       <w:tr>
-        <w:tblPrEx>
-          <w:tblCellMar>
-            <w:top w:w="0" w:type="dxa"/>
-            <w:bottom w:w="0" w:type="dxa"/>
-          </w:tblCellMar>
-        </w:tblPrEx>
         <w:tc>
           <w:tcPr>
             <w:tcW w:w="2400" w:type="dxa"/>
@@ -2190,12 +2112,6 @@
         </w:tc>
       </w:tr>
       <w:tr>
-        <w:tblPrEx>
-          <w:tblCellMar>
-            <w:top w:w="0" w:type="dxa"/>
-            <w:bottom w:w="0" w:type="dxa"/>
-          </w:tblCellMar>
-        </w:tblPrEx>
         <w:tc>
           <w:tcPr>
             <w:tcW w:w="2400" w:type="dxa"/>
@@ -2255,12 +2171,6 @@
         </w:tc>
       </w:tr>
       <w:tr>
-        <w:tblPrEx>
-          <w:tblCellMar>
-            <w:top w:w="0" w:type="dxa"/>
-            <w:bottom w:w="0" w:type="dxa"/>
-          </w:tblCellMar>
-        </w:tblPrEx>
         <w:tc>
           <w:tcPr>
             <w:tcW w:w="2400" w:type="dxa"/>
@@ -2320,12 +2230,6 @@
         </w:tc>
       </w:tr>
       <w:tr>
-        <w:tblPrEx>
-          <w:tblCellMar>
-            <w:top w:w="0" w:type="dxa"/>
-            <w:bottom w:w="0" w:type="dxa"/>
-          </w:tblCellMar>
-        </w:tblPrEx>
         <w:tc>
           <w:tcPr>
             <w:tcW w:w="2400" w:type="dxa"/>
@@ -2421,12 +2325,6 @@
         <w:gridCol w:w="6960"/>
       </w:tblGrid>
       <w:tr>
-        <w:tblPrEx>
-          <w:tblCellMar>
-            <w:top w:w="0" w:type="dxa"/>
-            <w:bottom w:w="0" w:type="dxa"/>
-          </w:tblCellMar>
-        </w:tblPrEx>
         <w:tc>
           <w:tcPr>
             <w:tcW w:w="2400" w:type="dxa"/>
@@ -2491,12 +2389,6 @@
         </w:tc>
       </w:tr>
       <w:tr>
-        <w:tblPrEx>
-          <w:tblCellMar>
-            <w:top w:w="0" w:type="dxa"/>
-            <w:bottom w:w="0" w:type="dxa"/>
-          </w:tblCellMar>
-        </w:tblPrEx>
         <w:tc>
           <w:tcPr>
             <w:tcW w:w="2400" w:type="dxa"/>
@@ -2556,12 +2448,6 @@
         </w:tc>
       </w:tr>
       <w:tr>
-        <w:tblPrEx>
-          <w:tblCellMar>
-            <w:top w:w="0" w:type="dxa"/>
-            <w:bottom w:w="0" w:type="dxa"/>
-          </w:tblCellMar>
-        </w:tblPrEx>
         <w:tc>
           <w:tcPr>
             <w:tcW w:w="2400" w:type="dxa"/>
@@ -2621,12 +2507,6 @@
         </w:tc>
       </w:tr>
       <w:tr>
-        <w:tblPrEx>
-          <w:tblCellMar>
-            <w:top w:w="0" w:type="dxa"/>
-            <w:bottom w:w="0" w:type="dxa"/>
-          </w:tblCellMar>
-        </w:tblPrEx>
         <w:tc>
           <w:tcPr>
             <w:tcW w:w="2400" w:type="dxa"/>
@@ -2686,12 +2566,6 @@
         </w:tc>
       </w:tr>
       <w:tr>
-        <w:tblPrEx>
-          <w:tblCellMar>
-            <w:top w:w="0" w:type="dxa"/>
-            <w:bottom w:w="0" w:type="dxa"/>
-          </w:tblCellMar>
-        </w:tblPrEx>
         <w:tc>
           <w:tcPr>
             <w:tcW w:w="2400" w:type="dxa"/>
@@ -2751,12 +2625,6 @@
         </w:tc>
       </w:tr>
       <w:tr>
-        <w:tblPrEx>
-          <w:tblCellMar>
-            <w:top w:w="0" w:type="dxa"/>
-            <w:bottom w:w="0" w:type="dxa"/>
-          </w:tblCellMar>
-        </w:tblPrEx>
         <w:tc>
           <w:tcPr>
             <w:tcW w:w="2400" w:type="dxa"/>
@@ -2821,22 +2689,7 @@
         <w:pStyle w:val="Heading2"/>
       </w:pPr>
       <w:r>
-        <w:t>3.</w:t>
-      </w:r>
-      <w:r>
-        <w:t>4</w:t>
-      </w:r>
-      <w:r>
-        <w:t xml:space="preserve"> User Persona </w:t>
-      </w:r>
-      <w:r>
-        <w:t>3</w:t>
-      </w:r>
-      <w:r>
-        <w:t xml:space="preserve"> — </w:t>
-      </w:r>
-      <w:r>
-        <w:t>CFO</w:t>
+        <w:t>3.4 User Persona 3 — CFO</w:t>
       </w:r>
     </w:p>
     <w:tbl>
@@ -2861,12 +2714,6 @@
         <w:gridCol w:w="6960"/>
       </w:tblGrid>
       <w:tr>
-        <w:tblPrEx>
-          <w:tblCellMar>
-            <w:top w:w="0" w:type="dxa"/>
-            <w:bottom w:w="0" w:type="dxa"/>
-          </w:tblCellMar>
-        </w:tblPrEx>
         <w:tc>
           <w:tcPr>
             <w:tcW w:w="2400" w:type="dxa"/>
@@ -2931,12 +2778,6 @@
         </w:tc>
       </w:tr>
       <w:tr>
-        <w:tblPrEx>
-          <w:tblCellMar>
-            <w:top w:w="0" w:type="dxa"/>
-            <w:bottom w:w="0" w:type="dxa"/>
-          </w:tblCellMar>
-        </w:tblPrEx>
         <w:tc>
           <w:tcPr>
             <w:tcW w:w="2400" w:type="dxa"/>
@@ -2992,12 +2833,6 @@
         </w:tc>
       </w:tr>
       <w:tr>
-        <w:tblPrEx>
-          <w:tblCellMar>
-            <w:top w:w="0" w:type="dxa"/>
-            <w:bottom w:w="0" w:type="dxa"/>
-          </w:tblCellMar>
-        </w:tblPrEx>
         <w:tc>
           <w:tcPr>
             <w:tcW w:w="2400" w:type="dxa"/>
@@ -3057,12 +2892,6 @@
         </w:tc>
       </w:tr>
       <w:tr>
-        <w:tblPrEx>
-          <w:tblCellMar>
-            <w:top w:w="0" w:type="dxa"/>
-            <w:bottom w:w="0" w:type="dxa"/>
-          </w:tblCellMar>
-        </w:tblPrEx>
         <w:tc>
           <w:tcPr>
             <w:tcW w:w="2400" w:type="dxa"/>
@@ -3122,12 +2951,6 @@
         </w:tc>
       </w:tr>
       <w:tr>
-        <w:tblPrEx>
-          <w:tblCellMar>
-            <w:top w:w="0" w:type="dxa"/>
-            <w:bottom w:w="0" w:type="dxa"/>
-          </w:tblCellMar>
-        </w:tblPrEx>
         <w:tc>
           <w:tcPr>
             <w:tcW w:w="2400" w:type="dxa"/>
@@ -3187,12 +3010,6 @@
         </w:tc>
       </w:tr>
       <w:tr>
-        <w:tblPrEx>
-          <w:tblCellMar>
-            <w:top w:w="0" w:type="dxa"/>
-            <w:bottom w:w="0" w:type="dxa"/>
-          </w:tblCellMar>
-        </w:tblPrEx>
         <w:trPr>
           <w:trHeight w:val="250"/>
         </w:trPr>
@@ -3289,12 +3106,6 @@
         <w:gridCol w:w="4394"/>
       </w:tblGrid>
       <w:tr>
-        <w:tblPrEx>
-          <w:tblCellMar>
-            <w:top w:w="0" w:type="dxa"/>
-            <w:bottom w:w="0" w:type="dxa"/>
-          </w:tblCellMar>
-        </w:tblPrEx>
         <w:tc>
           <w:tcPr>
             <w:tcW w:w="1862" w:type="dxa"/>
@@ -3392,12 +3203,6 @@
         </w:tc>
       </w:tr>
       <w:tr>
-        <w:tblPrEx>
-          <w:tblCellMar>
-            <w:top w:w="0" w:type="dxa"/>
-            <w:bottom w:w="0" w:type="dxa"/>
-          </w:tblCellMar>
-        </w:tblPrEx>
         <w:tc>
           <w:tcPr>
             <w:tcW w:w="1862" w:type="dxa"/>
@@ -3484,12 +3289,6 @@
         </w:tc>
       </w:tr>
       <w:tr>
-        <w:tblPrEx>
-          <w:tblCellMar>
-            <w:top w:w="0" w:type="dxa"/>
-            <w:bottom w:w="0" w:type="dxa"/>
-          </w:tblCellMar>
-        </w:tblPrEx>
         <w:tc>
           <w:tcPr>
             <w:tcW w:w="1862" w:type="dxa"/>
@@ -3576,12 +3375,6 @@
         </w:tc>
       </w:tr>
       <w:tr>
-        <w:tblPrEx>
-          <w:tblCellMar>
-            <w:top w:w="0" w:type="dxa"/>
-            <w:bottom w:w="0" w:type="dxa"/>
-          </w:tblCellMar>
-        </w:tblPrEx>
         <w:tc>
           <w:tcPr>
             <w:tcW w:w="1862" w:type="dxa"/>
@@ -3930,13 +3723,23 @@
         </w:numPr>
         <w:spacing w:before="20" w:after="40"/>
       </w:pPr>
+      <w:proofErr w:type="spellStart"/>
       <w:r>
         <w:rPr>
           <w:color w:val="666666"/>
           <w:sz w:val="20"/>
           <w:szCs w:val="20"/>
         </w:rPr>
-        <w:t>fact_sales — grain: one row per order line</w:t>
+        <w:t>fact_sales</w:t>
+      </w:r>
+      <w:proofErr w:type="spellEnd"/>
+      <w:r>
+        <w:rPr>
+          <w:color w:val="666666"/>
+          <w:sz w:val="20"/>
+          <w:szCs w:val="20"/>
+        </w:rPr>
+        <w:t xml:space="preserve"> — grain: one row per order line</w:t>
       </w:r>
     </w:p>
     <w:p>
@@ -3948,13 +3751,77 @@
         </w:numPr>
         <w:spacing w:before="20" w:after="40"/>
       </w:pPr>
+      <w:proofErr w:type="spellStart"/>
       <w:r>
         <w:rPr>
           <w:color w:val="666666"/>
           <w:sz w:val="20"/>
           <w:szCs w:val="20"/>
         </w:rPr>
-        <w:t>dim_customer — SCD Type 2 with effective_date, expiry_date, is_current flag</w:t>
+        <w:t>dim_customer</w:t>
+      </w:r>
+      <w:proofErr w:type="spellEnd"/>
+      <w:r>
+        <w:rPr>
+          <w:color w:val="666666"/>
+          <w:sz w:val="20"/>
+          <w:szCs w:val="20"/>
+        </w:rPr>
+        <w:t xml:space="preserve"> — SCD Type 2 with </w:t>
+      </w:r>
+      <w:proofErr w:type="spellStart"/>
+      <w:r>
+        <w:rPr>
+          <w:color w:val="666666"/>
+          <w:sz w:val="20"/>
+          <w:szCs w:val="20"/>
+        </w:rPr>
+        <w:t>effective_date</w:t>
+      </w:r>
+      <w:proofErr w:type="spellEnd"/>
+      <w:r>
+        <w:rPr>
+          <w:color w:val="666666"/>
+          <w:sz w:val="20"/>
+          <w:szCs w:val="20"/>
+        </w:rPr>
+        <w:t xml:space="preserve">, </w:t>
+      </w:r>
+      <w:proofErr w:type="spellStart"/>
+      <w:r>
+        <w:rPr>
+          <w:color w:val="666666"/>
+          <w:sz w:val="20"/>
+          <w:szCs w:val="20"/>
+        </w:rPr>
+        <w:t>expiry_date</w:t>
+      </w:r>
+      <w:proofErr w:type="spellEnd"/>
+      <w:r>
+        <w:rPr>
+          <w:color w:val="666666"/>
+          <w:sz w:val="20"/>
+          <w:szCs w:val="20"/>
+        </w:rPr>
+        <w:t xml:space="preserve">, </w:t>
+      </w:r>
+      <w:proofErr w:type="spellStart"/>
+      <w:r>
+        <w:rPr>
+          <w:color w:val="666666"/>
+          <w:sz w:val="20"/>
+          <w:szCs w:val="20"/>
+        </w:rPr>
+        <w:t>is_current</w:t>
+      </w:r>
+      <w:proofErr w:type="spellEnd"/>
+      <w:r>
+        <w:rPr>
+          <w:color w:val="666666"/>
+          <w:sz w:val="20"/>
+          <w:szCs w:val="20"/>
+        </w:rPr>
+        <w:t xml:space="preserve"> flag</w:t>
       </w:r>
     </w:p>
     <w:p>
@@ -3966,13 +3833,41 @@
         </w:numPr>
         <w:spacing w:before="20" w:after="40"/>
       </w:pPr>
+      <w:proofErr w:type="spellStart"/>
       <w:r>
         <w:rPr>
           <w:color w:val="666666"/>
           <w:sz w:val="20"/>
           <w:szCs w:val="20"/>
         </w:rPr>
-        <w:t>dim_product  — SCD Type 2 with category hierarchy</w:t>
+        <w:t>dim_</w:t>
+      </w:r>
+      <w:proofErr w:type="gramStart"/>
+      <w:r>
+        <w:rPr>
+          <w:color w:val="666666"/>
+          <w:sz w:val="20"/>
+          <w:szCs w:val="20"/>
+        </w:rPr>
+        <w:t>product</w:t>
+      </w:r>
+      <w:proofErr w:type="spellEnd"/>
+      <w:r>
+        <w:rPr>
+          <w:color w:val="666666"/>
+          <w:sz w:val="20"/>
+          <w:szCs w:val="20"/>
+        </w:rPr>
+        <w:t xml:space="preserve">  —</w:t>
+      </w:r>
+      <w:proofErr w:type="gramEnd"/>
+      <w:r>
+        <w:rPr>
+          <w:color w:val="666666"/>
+          <w:sz w:val="20"/>
+          <w:szCs w:val="20"/>
+        </w:rPr>
+        <w:t xml:space="preserve"> SCD Type 2 with category hierarchy</w:t>
       </w:r>
     </w:p>
     <w:p>
@@ -3984,13 +3879,23 @@
         </w:numPr>
         <w:spacing w:before="20" w:after="40"/>
       </w:pPr>
+      <w:proofErr w:type="spellStart"/>
       <w:r>
         <w:rPr>
           <w:color w:val="666666"/>
           <w:sz w:val="20"/>
           <w:szCs w:val="20"/>
         </w:rPr>
-        <w:t>dim_date     — full calendar dimension with fiscal periods</w:t>
+        <w:t>dim_date</w:t>
+      </w:r>
+      <w:proofErr w:type="spellEnd"/>
+      <w:r>
+        <w:rPr>
+          <w:color w:val="666666"/>
+          <w:sz w:val="20"/>
+          <w:szCs w:val="20"/>
+        </w:rPr>
+        <w:t xml:space="preserve">     — full calendar dimension with fiscal periods</w:t>
       </w:r>
     </w:p>
     <w:p>
@@ -4002,13 +3907,23 @@
         </w:numPr>
         <w:spacing w:before="20" w:after="40"/>
       </w:pPr>
+      <w:proofErr w:type="spellStart"/>
       <w:r>
         <w:rPr>
           <w:color w:val="666666"/>
           <w:sz w:val="20"/>
           <w:szCs w:val="20"/>
         </w:rPr>
-        <w:t>dim_location — region, country, city hierarchy</w:t>
+        <w:t>dim_location</w:t>
+      </w:r>
+      <w:proofErr w:type="spellEnd"/>
+      <w:r>
+        <w:rPr>
+          <w:color w:val="666666"/>
+          <w:sz w:val="20"/>
+          <w:szCs w:val="20"/>
+        </w:rPr>
+        <w:t xml:space="preserve"> — region, country, city hierarchy</w:t>
       </w:r>
     </w:p>
     <w:p>
@@ -4021,7 +3936,15 @@
         <w:spacing w:before="40" w:after="60"/>
       </w:pPr>
       <w:r>
-        <w:t>Create KPI views in the Gold layer:</w:t>
+        <w:t xml:space="preserve">Create KPI views in the </w:t>
+      </w:r>
+      <w:proofErr w:type="gramStart"/>
+      <w:r>
+        <w:t>Gold</w:t>
+      </w:r>
+      <w:proofErr w:type="gramEnd"/>
+      <w:r>
+        <w:t xml:space="preserve"> layer:</w:t>
       </w:r>
     </w:p>
     <w:p>
@@ -4033,13 +3956,23 @@
         </w:numPr>
         <w:spacing w:before="20" w:after="40"/>
       </w:pPr>
+      <w:proofErr w:type="spellStart"/>
       <w:r>
         <w:rPr>
           <w:color w:val="666666"/>
           <w:sz w:val="20"/>
           <w:szCs w:val="20"/>
         </w:rPr>
-        <w:t>vw_kpi_revenue     — total revenue, MoM growth, YTD vs target</w:t>
+        <w:t>vw_kpi_revenue</w:t>
+      </w:r>
+      <w:proofErr w:type="spellEnd"/>
+      <w:r>
+        <w:rPr>
+          <w:color w:val="666666"/>
+          <w:sz w:val="20"/>
+          <w:szCs w:val="20"/>
+        </w:rPr>
+        <w:t xml:space="preserve">     — total revenue, MoM growth, YTD vs target</w:t>
       </w:r>
     </w:p>
     <w:p>
@@ -4051,13 +3984,23 @@
         </w:numPr>
         <w:spacing w:before="20" w:after="40"/>
       </w:pPr>
+      <w:proofErr w:type="spellStart"/>
       <w:r>
         <w:rPr>
           <w:color w:val="666666"/>
           <w:sz w:val="20"/>
           <w:szCs w:val="20"/>
         </w:rPr>
-        <w:t>vw_kpi_customer    — CLV, acquisition cost, churn rate</w:t>
+        <w:t>vw_kpi_customer</w:t>
+      </w:r>
+      <w:proofErr w:type="spellEnd"/>
+      <w:r>
+        <w:rPr>
+          <w:color w:val="666666"/>
+          <w:sz w:val="20"/>
+          <w:szCs w:val="20"/>
+        </w:rPr>
+        <w:t xml:space="preserve">    — CLV, acquisition cost, churn rate</w:t>
       </w:r>
     </w:p>
     <w:p>
@@ -4069,13 +4012,23 @@
         </w:numPr>
         <w:spacing w:before="20" w:after="40"/>
       </w:pPr>
+      <w:proofErr w:type="spellStart"/>
       <w:r>
         <w:rPr>
           <w:color w:val="666666"/>
           <w:sz w:val="20"/>
           <w:szCs w:val="20"/>
         </w:rPr>
-        <w:t>vw_kpi_product     — margin %, return rate, sell-through rate</w:t>
+        <w:t>vw_kpi_product</w:t>
+      </w:r>
+      <w:proofErr w:type="spellEnd"/>
+      <w:r>
+        <w:rPr>
+          <w:color w:val="666666"/>
+          <w:sz w:val="20"/>
+          <w:szCs w:val="20"/>
+        </w:rPr>
+        <w:t xml:space="preserve">     — margin %, return rate, sell-through rate</w:t>
       </w:r>
     </w:p>
     <w:p>
@@ -4114,7 +4067,15 @@
         <w:spacing w:before="40" w:after="60"/>
       </w:pPr>
       <w:r>
-        <w:t>Deliver an interactive executive dashboard (Power BI or Streamlit) with:</w:t>
+        <w:t xml:space="preserve">Deliver an interactive executive dashboard (Power BI or </w:t>
+      </w:r>
+      <w:proofErr w:type="spellStart"/>
+      <w:r>
+        <w:t>Streamlit</w:t>
+      </w:r>
+      <w:proofErr w:type="spellEnd"/>
+      <w:r>
+        <w:t>) with:</w:t>
       </w:r>
     </w:p>
     <w:p>
@@ -4212,7 +4173,23 @@
         <w:spacing w:before="40" w:after="60"/>
       </w:pPr>
       <w:r>
-        <w:t>All SQL transformations built as dbt models with schema.yml tests and auto-generated lineage docs</w:t>
+        <w:t xml:space="preserve">All SQL transformations built as </w:t>
+      </w:r>
+      <w:proofErr w:type="spellStart"/>
+      <w:r>
+        <w:t>dbt</w:t>
+      </w:r>
+      <w:proofErr w:type="spellEnd"/>
+      <w:r>
+        <w:t xml:space="preserve"> models with </w:t>
+      </w:r>
+      <w:proofErr w:type="spellStart"/>
+      <w:r>
+        <w:t>schema.yml</w:t>
+      </w:r>
+      <w:proofErr w:type="spellEnd"/>
+      <w:r>
+        <w:t xml:space="preserve"> tests and auto-generated lineage docs</w:t>
       </w:r>
     </w:p>
     <w:p>
@@ -4225,7 +4202,15 @@
         <w:spacing w:before="40" w:after="60"/>
       </w:pPr>
       <w:r>
-        <w:t>CI/CD pipeline via GitHub Actions: run dbt tests and Great Expectations on every pull request</w:t>
+        <w:t xml:space="preserve">CI/CD pipeline via GitHub Actions: run </w:t>
+      </w:r>
+      <w:proofErr w:type="spellStart"/>
+      <w:r>
+        <w:t>dbt</w:t>
+      </w:r>
+      <w:proofErr w:type="spellEnd"/>
+      <w:r>
+        <w:t xml:space="preserve"> tests and Great Expectations on every pull request</w:t>
       </w:r>
     </w:p>
     <w:p>
@@ -4291,12 +4276,6 @@
         <w:gridCol w:w="2000"/>
       </w:tblGrid>
       <w:tr>
-        <w:tblPrEx>
-          <w:tblCellMar>
-            <w:top w:w="0" w:type="dxa"/>
-            <w:bottom w:w="0" w:type="dxa"/>
-          </w:tblCellMar>
-        </w:tblPrEx>
         <w:tc>
           <w:tcPr>
             <w:tcW w:w="400" w:type="dxa"/>
@@ -4454,12 +4433,6 @@
         </w:tc>
       </w:tr>
       <w:tr>
-        <w:tblPrEx>
-          <w:tblCellMar>
-            <w:top w:w="0" w:type="dxa"/>
-            <w:bottom w:w="0" w:type="dxa"/>
-          </w:tblCellMar>
-        </w:tblPrEx>
         <w:tc>
           <w:tcPr>
             <w:tcW w:w="400" w:type="dxa"/>
@@ -4603,12 +4576,6 @@
         </w:tc>
       </w:tr>
       <w:tr>
-        <w:tblPrEx>
-          <w:tblCellMar>
-            <w:top w:w="0" w:type="dxa"/>
-            <w:bottom w:w="0" w:type="dxa"/>
-          </w:tblCellMar>
-        </w:tblPrEx>
         <w:tc>
           <w:tcPr>
             <w:tcW w:w="400" w:type="dxa"/>
@@ -4752,12 +4719,6 @@
         </w:tc>
       </w:tr>
       <w:tr>
-        <w:tblPrEx>
-          <w:tblCellMar>
-            <w:top w:w="0" w:type="dxa"/>
-            <w:bottom w:w="0" w:type="dxa"/>
-          </w:tblCellMar>
-        </w:tblPrEx>
         <w:tc>
           <w:tcPr>
             <w:tcW w:w="400" w:type="dxa"/>
@@ -4901,12 +4862,6 @@
         </w:tc>
       </w:tr>
       <w:tr>
-        <w:tblPrEx>
-          <w:tblCellMar>
-            <w:top w:w="0" w:type="dxa"/>
-            <w:bottom w:w="0" w:type="dxa"/>
-          </w:tblCellMar>
-        </w:tblPrEx>
         <w:tc>
           <w:tcPr>
             <w:tcW w:w="400" w:type="dxa"/>
@@ -5050,12 +5005,6 @@
         </w:tc>
       </w:tr>
       <w:tr>
-        <w:tblPrEx>
-          <w:tblCellMar>
-            <w:top w:w="0" w:type="dxa"/>
-            <w:bottom w:w="0" w:type="dxa"/>
-          </w:tblCellMar>
-        </w:tblPrEx>
         <w:tc>
           <w:tcPr>
             <w:tcW w:w="400" w:type="dxa"/>
@@ -5199,12 +5148,6 @@
         </w:tc>
       </w:tr>
       <w:tr>
-        <w:tblPrEx>
-          <w:tblCellMar>
-            <w:top w:w="0" w:type="dxa"/>
-            <w:bottom w:w="0" w:type="dxa"/>
-          </w:tblCellMar>
-        </w:tblPrEx>
         <w:tc>
           <w:tcPr>
             <w:tcW w:w="400" w:type="dxa"/>
@@ -5348,12 +5291,6 @@
         </w:tc>
       </w:tr>
       <w:tr>
-        <w:tblPrEx>
-          <w:tblCellMar>
-            <w:top w:w="0" w:type="dxa"/>
-            <w:bottom w:w="0" w:type="dxa"/>
-          </w:tblCellMar>
-        </w:tblPrEx>
         <w:tc>
           <w:tcPr>
             <w:tcW w:w="400" w:type="dxa"/>
@@ -5497,12 +5434,6 @@
         </w:tc>
       </w:tr>
       <w:tr>
-        <w:tblPrEx>
-          <w:tblCellMar>
-            <w:top w:w="0" w:type="dxa"/>
-            <w:bottom w:w="0" w:type="dxa"/>
-          </w:tblCellMar>
-        </w:tblPrEx>
         <w:tc>
           <w:tcPr>
             <w:tcW w:w="400" w:type="dxa"/>
@@ -5680,12 +5611,6 @@
         <w:gridCol w:w="3480"/>
       </w:tblGrid>
       <w:tr>
-        <w:tblPrEx>
-          <w:tblCellMar>
-            <w:top w:w="0" w:type="dxa"/>
-            <w:bottom w:w="0" w:type="dxa"/>
-          </w:tblCellMar>
-        </w:tblPrEx>
         <w:tc>
           <w:tcPr>
             <w:tcW w:w="2400" w:type="dxa"/>
@@ -5781,12 +5706,6 @@
         </w:tc>
       </w:tr>
       <w:tr>
-        <w:tblPrEx>
-          <w:tblCellMar>
-            <w:top w:w="0" w:type="dxa"/>
-            <w:bottom w:w="0" w:type="dxa"/>
-          </w:tblCellMar>
-        </w:tblPrEx>
         <w:tc>
           <w:tcPr>
             <w:tcW w:w="2400" w:type="dxa"/>
@@ -5868,18 +5787,30 @@
                 <w:sz w:val="20"/>
                 <w:szCs w:val="20"/>
               </w:rPr>
-              <w:t>95th percentile query time &lt; 5s on Gold views</w:t>
+              <w:t xml:space="preserve">95th percentile query time &lt; 5s on </w:t>
+            </w:r>
+            <w:proofErr w:type="gramStart"/>
+            <w:r>
+              <w:rPr>
+                <w:color w:val="666666"/>
+                <w:sz w:val="20"/>
+                <w:szCs w:val="20"/>
+              </w:rPr>
+              <w:t>Gold</w:t>
+            </w:r>
+            <w:proofErr w:type="gramEnd"/>
+            <w:r>
+              <w:rPr>
+                <w:color w:val="666666"/>
+                <w:sz w:val="20"/>
+                <w:szCs w:val="20"/>
+              </w:rPr>
+              <w:t xml:space="preserve"> views</w:t>
             </w:r>
           </w:p>
         </w:tc>
       </w:tr>
       <w:tr>
-        <w:tblPrEx>
-          <w:tblCellMar>
-            <w:top w:w="0" w:type="dxa"/>
-            <w:bottom w:w="0" w:type="dxa"/>
-          </w:tblCellMar>
-        </w:tblPrEx>
         <w:tc>
           <w:tcPr>
             <w:tcW w:w="2400" w:type="dxa"/>
@@ -5967,12 +5898,6 @@
         </w:tc>
       </w:tr>
       <w:tr>
-        <w:tblPrEx>
-          <w:tblCellMar>
-            <w:top w:w="0" w:type="dxa"/>
-            <w:bottom w:w="0" w:type="dxa"/>
-          </w:tblCellMar>
-        </w:tblPrEx>
         <w:tc>
           <w:tcPr>
             <w:tcW w:w="2400" w:type="dxa"/>
@@ -6054,18 +5979,30 @@
                 <w:sz w:val="20"/>
                 <w:szCs w:val="20"/>
               </w:rPr>
-              <w:t>Rerunning pipeline on same source produces identical Gold output</w:t>
+              <w:t xml:space="preserve">Rerunning pipeline on same source produces identical </w:t>
+            </w:r>
+            <w:proofErr w:type="gramStart"/>
+            <w:r>
+              <w:rPr>
+                <w:color w:val="666666"/>
+                <w:sz w:val="20"/>
+                <w:szCs w:val="20"/>
+              </w:rPr>
+              <w:t>Gold</w:t>
+            </w:r>
+            <w:proofErr w:type="gramEnd"/>
+            <w:r>
+              <w:rPr>
+                <w:color w:val="666666"/>
+                <w:sz w:val="20"/>
+                <w:szCs w:val="20"/>
+              </w:rPr>
+              <w:t xml:space="preserve"> output</w:t>
             </w:r>
           </w:p>
         </w:tc>
       </w:tr>
       <w:tr>
-        <w:tblPrEx>
-          <w:tblCellMar>
-            <w:top w:w="0" w:type="dxa"/>
-            <w:bottom w:w="0" w:type="dxa"/>
-          </w:tblCellMar>
-        </w:tblPrEx>
         <w:tc>
           <w:tcPr>
             <w:tcW w:w="2400" w:type="dxa"/>
@@ -6153,12 +6090,6 @@
         </w:tc>
       </w:tr>
       <w:tr>
-        <w:tblPrEx>
-          <w:tblCellMar>
-            <w:top w:w="0" w:type="dxa"/>
-            <w:bottom w:w="0" w:type="dxa"/>
-          </w:tblCellMar>
-        </w:tblPrEx>
         <w:tc>
           <w:tcPr>
             <w:tcW w:w="2400" w:type="dxa"/>
@@ -6240,18 +6171,40 @@
                 <w:sz w:val="20"/>
                 <w:szCs w:val="20"/>
               </w:rPr>
-              <w:t>100% of dbt models have a description in schema.yml</w:t>
-            </w:r>
+              <w:t xml:space="preserve">100% of </w:t>
+            </w:r>
+            <w:proofErr w:type="spellStart"/>
+            <w:r>
+              <w:rPr>
+                <w:color w:val="666666"/>
+                <w:sz w:val="20"/>
+                <w:szCs w:val="20"/>
+              </w:rPr>
+              <w:t>dbt</w:t>
+            </w:r>
+            <w:proofErr w:type="spellEnd"/>
+            <w:r>
+              <w:rPr>
+                <w:color w:val="666666"/>
+                <w:sz w:val="20"/>
+                <w:szCs w:val="20"/>
+              </w:rPr>
+              <w:t xml:space="preserve"> models have a description in </w:t>
+            </w:r>
+            <w:proofErr w:type="spellStart"/>
+            <w:r>
+              <w:rPr>
+                <w:color w:val="666666"/>
+                <w:sz w:val="20"/>
+                <w:szCs w:val="20"/>
+              </w:rPr>
+              <w:t>schema.yml</w:t>
+            </w:r>
+            <w:proofErr w:type="spellEnd"/>
           </w:p>
         </w:tc>
       </w:tr>
       <w:tr>
-        <w:tblPrEx>
-          <w:tblCellMar>
-            <w:top w:w="0" w:type="dxa"/>
-            <w:bottom w:w="0" w:type="dxa"/>
-          </w:tblCellMar>
-        </w:tblPrEx>
         <w:tc>
           <w:tcPr>
             <w:tcW w:w="2400" w:type="dxa"/>
@@ -6327,24 +6280,46 @@
             </w:tcMar>
           </w:tcPr>
           <w:p>
+            <w:proofErr w:type="spellStart"/>
             <w:r>
               <w:rPr>
                 <w:color w:val="666666"/>
                 <w:sz w:val="20"/>
                 <w:szCs w:val="20"/>
               </w:rPr>
-              <w:t>load_log table populated after each Bronze ingestion run</w:t>
+              <w:t>load_log</w:t>
+            </w:r>
+            <w:proofErr w:type="spellEnd"/>
+            <w:r>
+              <w:rPr>
+                <w:color w:val="666666"/>
+                <w:sz w:val="20"/>
+                <w:szCs w:val="20"/>
+              </w:rPr>
+              <w:t xml:space="preserve"> table populated after each </w:t>
+            </w:r>
+            <w:proofErr w:type="gramStart"/>
+            <w:r>
+              <w:rPr>
+                <w:color w:val="666666"/>
+                <w:sz w:val="20"/>
+                <w:szCs w:val="20"/>
+              </w:rPr>
+              <w:t>Bronze</w:t>
+            </w:r>
+            <w:proofErr w:type="gramEnd"/>
+            <w:r>
+              <w:rPr>
+                <w:color w:val="666666"/>
+                <w:sz w:val="20"/>
+                <w:szCs w:val="20"/>
+              </w:rPr>
+              <w:t xml:space="preserve"> ingestion run</w:t>
             </w:r>
           </w:p>
         </w:tc>
       </w:tr>
       <w:tr>
-        <w:tblPrEx>
-          <w:tblCellMar>
-            <w:top w:w="0" w:type="dxa"/>
-            <w:bottom w:w="0" w:type="dxa"/>
-          </w:tblCellMar>
-        </w:tblPrEx>
         <w:tc>
           <w:tcPr>
             <w:tcW w:w="2400" w:type="dxa"/>
@@ -6432,12 +6407,6 @@
         </w:tc>
       </w:tr>
       <w:tr>
-        <w:tblPrEx>
-          <w:tblCellMar>
-            <w:top w:w="0" w:type="dxa"/>
-            <w:bottom w:w="0" w:type="dxa"/>
-          </w:tblCellMar>
-        </w:tblPrEx>
         <w:tc>
           <w:tcPr>
             <w:tcW w:w="2400" w:type="dxa"/>
@@ -6542,7 +6511,15 @@
         <w:spacing w:after="120"/>
       </w:pPr>
       <w:r>
-        <w:t>All metrics surfaced in the Gold layer and dashboard are formally defined below. This is the single source of truth for metric semantics.</w:t>
+        <w:t xml:space="preserve">All metrics surfaced in the </w:t>
+      </w:r>
+      <w:proofErr w:type="gramStart"/>
+      <w:r>
+        <w:t>Gold</w:t>
+      </w:r>
+      <w:proofErr w:type="gramEnd"/>
+      <w:r>
+        <w:t xml:space="preserve"> layer and dashboard are formally defined below. This is the single source of truth for metric semantics.</w:t>
       </w:r>
     </w:p>
     <w:tbl>
@@ -6570,15 +6547,9 @@
         <w:gridCol w:w="1543"/>
       </w:tblGrid>
       <w:tr>
-        <w:tblPrEx>
-          <w:tblCellMar>
-            <w:top w:w="0" w:type="dxa"/>
-            <w:bottom w:w="0" w:type="dxa"/>
-          </w:tblCellMar>
-        </w:tblPrEx>
-        <w:tc>
-          <w:tcPr>
-            <w:tcW w:w="1800" w:type="dxa"/>
+        <w:tc>
+          <w:tcPr>
+            <w:tcW w:w="1742" w:type="dxa"/>
             <w:tcBorders>
               <w:top w:val="single" w:sz="1" w:space="0" w:color="CCCCCC"/>
               <w:left w:val="single" w:sz="1" w:space="0" w:color="CCCCCC"/>
@@ -6609,7 +6580,7 @@
         </w:tc>
         <w:tc>
           <w:tcPr>
-            <w:tcW w:w="2200" w:type="dxa"/>
+            <w:tcW w:w="2124" w:type="dxa"/>
             <w:tcBorders>
               <w:top w:val="single" w:sz="1" w:space="0" w:color="CCCCCC"/>
               <w:left w:val="single" w:sz="1" w:space="0" w:color="CCCCCC"/>
@@ -6640,7 +6611,7 @@
         </w:tc>
         <w:tc>
           <w:tcPr>
-            <w:tcW w:w="2160" w:type="dxa"/>
+            <w:tcW w:w="2225" w:type="dxa"/>
             <w:tcBorders>
               <w:top w:val="single" w:sz="1" w:space="0" w:color="CCCCCC"/>
               <w:left w:val="single" w:sz="1" w:space="0" w:color="CCCCCC"/>
@@ -6671,7 +6642,7 @@
         </w:tc>
         <w:tc>
           <w:tcPr>
-            <w:tcW w:w="1600" w:type="dxa"/>
+            <w:tcW w:w="1726" w:type="dxa"/>
             <w:tcBorders>
               <w:top w:val="single" w:sz="1" w:space="0" w:color="CCCCCC"/>
               <w:left w:val="single" w:sz="1" w:space="0" w:color="CCCCCC"/>
@@ -6702,7 +6673,7 @@
         </w:tc>
         <w:tc>
           <w:tcPr>
-            <w:tcW w:w="1600" w:type="dxa"/>
+            <w:tcW w:w="1543" w:type="dxa"/>
             <w:tcBorders>
               <w:top w:val="single" w:sz="1" w:space="0" w:color="CCCCCC"/>
               <w:left w:val="single" w:sz="1" w:space="0" w:color="CCCCCC"/>
@@ -6733,15 +6704,9 @@
         </w:tc>
       </w:tr>
       <w:tr>
-        <w:tblPrEx>
-          <w:tblCellMar>
-            <w:top w:w="0" w:type="dxa"/>
-            <w:bottom w:w="0" w:type="dxa"/>
-          </w:tblCellMar>
-        </w:tblPrEx>
-        <w:tc>
-          <w:tcPr>
-            <w:tcW w:w="1800" w:type="dxa"/>
+        <w:tc>
+          <w:tcPr>
+            <w:tcW w:w="1742" w:type="dxa"/>
             <w:tcBorders>
               <w:top w:val="single" w:sz="1" w:space="0" w:color="CCCCCC"/>
               <w:left w:val="single" w:sz="1" w:space="0" w:color="CCCCCC"/>
@@ -6771,7 +6736,7 @@
         </w:tc>
         <w:tc>
           <w:tcPr>
-            <w:tcW w:w="2200" w:type="dxa"/>
+            <w:tcW w:w="2124" w:type="dxa"/>
             <w:tcBorders>
               <w:top w:val="single" w:sz="1" w:space="0" w:color="CCCCCC"/>
               <w:left w:val="single" w:sz="1" w:space="0" w:color="CCCCCC"/>
@@ -6798,7 +6763,7 @@
         </w:tc>
         <w:tc>
           <w:tcPr>
-            <w:tcW w:w="2160" w:type="dxa"/>
+            <w:tcW w:w="2225" w:type="dxa"/>
             <w:tcBorders>
               <w:top w:val="single" w:sz="1" w:space="0" w:color="CCCCCC"/>
               <w:left w:val="single" w:sz="1" w:space="0" w:color="CCCCCC"/>
@@ -6814,317 +6779,39 @@
             </w:tcMar>
           </w:tcPr>
           <w:p>
+            <w:proofErr w:type="gramStart"/>
             <w:r>
               <w:rPr>
                 <w:rFonts w:ascii="Courier New" w:eastAsia="Courier New" w:hAnsi="Courier New" w:cs="Courier New"/>
                 <w:sz w:val="18"/>
                 <w:szCs w:val="18"/>
               </w:rPr>
-              <w:t>SUM(unit_price × quantity)</w:t>
-            </w:r>
-          </w:p>
-        </w:tc>
-        <w:tc>
-          <w:tcPr>
-            <w:tcW w:w="1600" w:type="dxa"/>
-            <w:tcBorders>
-              <w:top w:val="single" w:sz="1" w:space="0" w:color="CCCCCC"/>
-              <w:left w:val="single" w:sz="1" w:space="0" w:color="CCCCCC"/>
-              <w:bottom w:val="single" w:sz="1" w:space="0" w:color="CCCCCC"/>
-              <w:right w:val="single" w:sz="1" w:space="0" w:color="CCCCCC"/>
-            </w:tcBorders>
-            <w:shd w:val="clear" w:color="auto" w:fill="FFFFFF"/>
-            <w:tcMar>
-              <w:top w:w="80" w:type="dxa"/>
-              <w:left w:w="140" w:type="dxa"/>
-              <w:bottom w:w="80" w:type="dxa"/>
-              <w:right w:w="140" w:type="dxa"/>
-            </w:tcMar>
-          </w:tcPr>
-          <w:p>
-            <w:r>
-              <w:rPr>
-                <w:color w:val="666666"/>
-                <w:sz w:val="20"/>
-                <w:szCs w:val="20"/>
-              </w:rPr>
-              <w:t>fact_sales</w:t>
-            </w:r>
-          </w:p>
-        </w:tc>
-        <w:tc>
-          <w:tcPr>
-            <w:tcW w:w="1600" w:type="dxa"/>
-            <w:tcBorders>
-              <w:top w:val="single" w:sz="1" w:space="0" w:color="CCCCCC"/>
-              <w:left w:val="single" w:sz="1" w:space="0" w:color="CCCCCC"/>
-              <w:bottom w:val="single" w:sz="1" w:space="0" w:color="CCCCCC"/>
-              <w:right w:val="single" w:sz="1" w:space="0" w:color="CCCCCC"/>
-            </w:tcBorders>
-            <w:shd w:val="clear" w:color="auto" w:fill="FFFFFF"/>
-            <w:tcMar>
-              <w:top w:w="80" w:type="dxa"/>
-              <w:left w:w="140" w:type="dxa"/>
-              <w:bottom w:w="80" w:type="dxa"/>
-              <w:right w:w="140" w:type="dxa"/>
-            </w:tcMar>
-          </w:tcPr>
-          <w:p>
-            <w:r>
-              <w:rPr>
-                <w:color w:val="666666"/>
-                <w:sz w:val="20"/>
-                <w:szCs w:val="20"/>
-              </w:rPr>
-              <w:t>Daily</w:t>
-            </w:r>
-          </w:p>
-        </w:tc>
-      </w:tr>
-      <w:tr>
-        <w:tblPrEx>
-          <w:tblCellMar>
-            <w:top w:w="0" w:type="dxa"/>
-            <w:bottom w:w="0" w:type="dxa"/>
-          </w:tblCellMar>
-        </w:tblPrEx>
-        <w:tc>
-          <w:tcPr>
-            <w:tcW w:w="1800" w:type="dxa"/>
-            <w:tcBorders>
-              <w:top w:val="single" w:sz="1" w:space="0" w:color="CCCCCC"/>
-              <w:left w:val="single" w:sz="1" w:space="0" w:color="CCCCCC"/>
-              <w:bottom w:val="single" w:sz="1" w:space="0" w:color="CCCCCC"/>
-              <w:right w:val="single" w:sz="1" w:space="0" w:color="CCCCCC"/>
-            </w:tcBorders>
-            <w:shd w:val="clear" w:color="auto" w:fill="D9E8F5"/>
-            <w:tcMar>
-              <w:top w:w="80" w:type="dxa"/>
-              <w:left w:w="140" w:type="dxa"/>
-              <w:bottom w:w="80" w:type="dxa"/>
-              <w:right w:w="140" w:type="dxa"/>
-            </w:tcMar>
-          </w:tcPr>
-          <w:p>
-            <w:r>
-              <w:rPr>
-                <w:b/>
-                <w:bCs/>
-                <w:color w:val="1F3864"/>
-                <w:sz w:val="20"/>
-                <w:szCs w:val="20"/>
-              </w:rPr>
-              <w:t>Net Revenue</w:t>
-            </w:r>
-          </w:p>
-        </w:tc>
-        <w:tc>
-          <w:tcPr>
-            <w:tcW w:w="2200" w:type="dxa"/>
-            <w:tcBorders>
-              <w:top w:val="single" w:sz="1" w:space="0" w:color="CCCCCC"/>
-              <w:left w:val="single" w:sz="1" w:space="0" w:color="CCCCCC"/>
-              <w:bottom w:val="single" w:sz="1" w:space="0" w:color="CCCCCC"/>
-              <w:right w:val="single" w:sz="1" w:space="0" w:color="CCCCCC"/>
-            </w:tcBorders>
-            <w:shd w:val="clear" w:color="auto" w:fill="F2F2F2"/>
-            <w:tcMar>
-              <w:top w:w="80" w:type="dxa"/>
-              <w:left w:w="140" w:type="dxa"/>
-              <w:bottom w:w="80" w:type="dxa"/>
-              <w:right w:w="140" w:type="dxa"/>
-            </w:tcMar>
-          </w:tcPr>
-          <w:p>
-            <w:r>
-              <w:rPr>
-                <w:sz w:val="20"/>
-                <w:szCs w:val="20"/>
-              </w:rPr>
-              <w:t>Revenue after refunds and cancellations</w:t>
-            </w:r>
-          </w:p>
-        </w:tc>
-        <w:tc>
-          <w:tcPr>
-            <w:tcW w:w="2160" w:type="dxa"/>
-            <w:tcBorders>
-              <w:top w:val="single" w:sz="1" w:space="0" w:color="CCCCCC"/>
-              <w:left w:val="single" w:sz="1" w:space="0" w:color="CCCCCC"/>
-              <w:bottom w:val="single" w:sz="1" w:space="0" w:color="CCCCCC"/>
-              <w:right w:val="single" w:sz="1" w:space="0" w:color="CCCCCC"/>
-            </w:tcBorders>
-            <w:shd w:val="clear" w:color="auto" w:fill="F2F2F2"/>
-            <w:tcMar>
-              <w:top w:w="80" w:type="dxa"/>
-              <w:left w:w="140" w:type="dxa"/>
-              <w:bottom w:w="80" w:type="dxa"/>
-              <w:right w:w="140" w:type="dxa"/>
-            </w:tcMar>
-          </w:tcPr>
-          <w:p>
+              <w:t>SUM(</w:t>
+            </w:r>
+            <w:proofErr w:type="spellStart"/>
+            <w:proofErr w:type="gramEnd"/>
             <w:r>
               <w:rPr>
                 <w:rFonts w:ascii="Courier New" w:eastAsia="Courier New" w:hAnsi="Courier New" w:cs="Courier New"/>
                 <w:sz w:val="18"/>
                 <w:szCs w:val="18"/>
               </w:rPr>
-              <w:t>Total Revenue − SUM(refund_amount)</w:t>
-            </w:r>
-          </w:p>
-        </w:tc>
-        <w:tc>
-          <w:tcPr>
-            <w:tcW w:w="1600" w:type="dxa"/>
-            <w:tcBorders>
-              <w:top w:val="single" w:sz="1" w:space="0" w:color="CCCCCC"/>
-              <w:left w:val="single" w:sz="1" w:space="0" w:color="CCCCCC"/>
-              <w:bottom w:val="single" w:sz="1" w:space="0" w:color="CCCCCC"/>
-              <w:right w:val="single" w:sz="1" w:space="0" w:color="CCCCCC"/>
-            </w:tcBorders>
-            <w:shd w:val="clear" w:color="auto" w:fill="F2F2F2"/>
-            <w:tcMar>
-              <w:top w:w="80" w:type="dxa"/>
-              <w:left w:w="140" w:type="dxa"/>
-              <w:bottom w:w="80" w:type="dxa"/>
-              <w:right w:w="140" w:type="dxa"/>
-            </w:tcMar>
-          </w:tcPr>
-          <w:p>
-            <w:r>
-              <w:rPr>
-                <w:color w:val="666666"/>
-                <w:sz w:val="20"/>
-                <w:szCs w:val="20"/>
-              </w:rPr>
-              <w:t>fact_sales</w:t>
-            </w:r>
-          </w:p>
-        </w:tc>
-        <w:tc>
-          <w:tcPr>
-            <w:tcW w:w="1600" w:type="dxa"/>
-            <w:tcBorders>
-              <w:top w:val="single" w:sz="1" w:space="0" w:color="CCCCCC"/>
-              <w:left w:val="single" w:sz="1" w:space="0" w:color="CCCCCC"/>
-              <w:bottom w:val="single" w:sz="1" w:space="0" w:color="CCCCCC"/>
-              <w:right w:val="single" w:sz="1" w:space="0" w:color="CCCCCC"/>
-            </w:tcBorders>
-            <w:shd w:val="clear" w:color="auto" w:fill="F2F2F2"/>
-            <w:tcMar>
-              <w:top w:w="80" w:type="dxa"/>
-              <w:left w:w="140" w:type="dxa"/>
-              <w:bottom w:w="80" w:type="dxa"/>
-              <w:right w:w="140" w:type="dxa"/>
-            </w:tcMar>
-          </w:tcPr>
-          <w:p>
-            <w:r>
-              <w:rPr>
-                <w:color w:val="666666"/>
-                <w:sz w:val="20"/>
-                <w:szCs w:val="20"/>
-              </w:rPr>
-              <w:t>Daily</w:t>
-            </w:r>
-          </w:p>
-        </w:tc>
-      </w:tr>
-      <w:tr>
-        <w:tblPrEx>
-          <w:tblCellMar>
-            <w:top w:w="0" w:type="dxa"/>
-            <w:bottom w:w="0" w:type="dxa"/>
-          </w:tblCellMar>
-        </w:tblPrEx>
-        <w:tc>
-          <w:tcPr>
-            <w:tcW w:w="1800" w:type="dxa"/>
-            <w:tcBorders>
-              <w:top w:val="single" w:sz="1" w:space="0" w:color="CCCCCC"/>
-              <w:left w:val="single" w:sz="1" w:space="0" w:color="CCCCCC"/>
-              <w:bottom w:val="single" w:sz="1" w:space="0" w:color="CCCCCC"/>
-              <w:right w:val="single" w:sz="1" w:space="0" w:color="CCCCCC"/>
-            </w:tcBorders>
-            <w:shd w:val="clear" w:color="auto" w:fill="D9E8F5"/>
-            <w:tcMar>
-              <w:top w:w="80" w:type="dxa"/>
-              <w:left w:w="140" w:type="dxa"/>
-              <w:bottom w:w="80" w:type="dxa"/>
-              <w:right w:w="140" w:type="dxa"/>
-            </w:tcMar>
-          </w:tcPr>
-          <w:p>
-            <w:r>
-              <w:rPr>
-                <w:b/>
-                <w:bCs/>
-                <w:color w:val="1F3864"/>
-                <w:sz w:val="20"/>
-                <w:szCs w:val="20"/>
-              </w:rPr>
-              <w:t>Gross Margin %</w:t>
-            </w:r>
-          </w:p>
-        </w:tc>
-        <w:tc>
-          <w:tcPr>
-            <w:tcW w:w="2200" w:type="dxa"/>
-            <w:tcBorders>
-              <w:top w:val="single" w:sz="1" w:space="0" w:color="CCCCCC"/>
-              <w:left w:val="single" w:sz="1" w:space="0" w:color="CCCCCC"/>
-              <w:bottom w:val="single" w:sz="1" w:space="0" w:color="CCCCCC"/>
-              <w:right w:val="single" w:sz="1" w:space="0" w:color="CCCCCC"/>
-            </w:tcBorders>
-            <w:shd w:val="clear" w:color="auto" w:fill="FFFFFF"/>
-            <w:tcMar>
-              <w:top w:w="80" w:type="dxa"/>
-              <w:left w:w="140" w:type="dxa"/>
-              <w:bottom w:w="80" w:type="dxa"/>
-              <w:right w:w="140" w:type="dxa"/>
-            </w:tcMar>
-          </w:tcPr>
-          <w:p>
-            <w:r>
-              <w:rPr>
-                <w:sz w:val="20"/>
-                <w:szCs w:val="20"/>
-              </w:rPr>
-              <w:t>Profitability as % of revenue</w:t>
-            </w:r>
-          </w:p>
-        </w:tc>
-        <w:tc>
-          <w:tcPr>
-            <w:tcW w:w="2160" w:type="dxa"/>
-            <w:tcBorders>
-              <w:top w:val="single" w:sz="1" w:space="0" w:color="CCCCCC"/>
-              <w:left w:val="single" w:sz="1" w:space="0" w:color="CCCCCC"/>
-              <w:bottom w:val="single" w:sz="1" w:space="0" w:color="CCCCCC"/>
-              <w:right w:val="single" w:sz="1" w:space="0" w:color="CCCCCC"/>
-            </w:tcBorders>
-            <w:shd w:val="clear" w:color="auto" w:fill="FFFFFF"/>
-            <w:tcMar>
-              <w:top w:w="80" w:type="dxa"/>
-              <w:left w:w="140" w:type="dxa"/>
-              <w:bottom w:w="80" w:type="dxa"/>
-              <w:right w:w="140" w:type="dxa"/>
-            </w:tcMar>
-          </w:tcPr>
-          <w:p>
+              <w:t>unit_price</w:t>
+            </w:r>
+            <w:proofErr w:type="spellEnd"/>
             <w:r>
               <w:rPr>
                 <w:rFonts w:ascii="Courier New" w:eastAsia="Courier New" w:hAnsi="Courier New" w:cs="Courier New"/>
                 <w:sz w:val="18"/>
                 <w:szCs w:val="18"/>
               </w:rPr>
-              <w:t>(Revenue − COGS) / Revenue × 100</w:t>
-            </w:r>
-          </w:p>
-        </w:tc>
-        <w:tc>
-          <w:tcPr>
-            <w:tcW w:w="1600" w:type="dxa"/>
+              <w:t xml:space="preserve"> × quantity)</w:t>
+            </w:r>
+          </w:p>
+        </w:tc>
+        <w:tc>
+          <w:tcPr>
+            <w:tcW w:w="1726" w:type="dxa"/>
             <w:tcBorders>
               <w:top w:val="single" w:sz="1" w:space="0" w:color="CCCCCC"/>
               <w:left w:val="single" w:sz="1" w:space="0" w:color="CCCCCC"/>
@@ -7140,19 +6827,21 @@
             </w:tcMar>
           </w:tcPr>
           <w:p>
+            <w:proofErr w:type="spellStart"/>
             <w:r>
               <w:rPr>
                 <w:color w:val="666666"/>
                 <w:sz w:val="20"/>
                 <w:szCs w:val="20"/>
               </w:rPr>
-              <w:t>fact_sales + dim_product</w:t>
-            </w:r>
-          </w:p>
-        </w:tc>
-        <w:tc>
-          <w:tcPr>
-            <w:tcW w:w="1600" w:type="dxa"/>
+              <w:t>fact_sales</w:t>
+            </w:r>
+            <w:proofErr w:type="spellEnd"/>
+          </w:p>
+        </w:tc>
+        <w:tc>
+          <w:tcPr>
+            <w:tcW w:w="1543" w:type="dxa"/>
             <w:tcBorders>
               <w:top w:val="single" w:sz="1" w:space="0" w:color="CCCCCC"/>
               <w:left w:val="single" w:sz="1" w:space="0" w:color="CCCCCC"/>
@@ -7180,15 +6869,9 @@
         </w:tc>
       </w:tr>
       <w:tr>
-        <w:tblPrEx>
-          <w:tblCellMar>
-            <w:top w:w="0" w:type="dxa"/>
-            <w:bottom w:w="0" w:type="dxa"/>
-          </w:tblCellMar>
-        </w:tblPrEx>
-        <w:tc>
-          <w:tcPr>
-            <w:tcW w:w="1800" w:type="dxa"/>
+        <w:tc>
+          <w:tcPr>
+            <w:tcW w:w="1742" w:type="dxa"/>
             <w:tcBorders>
               <w:top w:val="single" w:sz="1" w:space="0" w:color="CCCCCC"/>
               <w:left w:val="single" w:sz="1" w:space="0" w:color="CCCCCC"/>
@@ -7212,13 +6895,13 @@
                 <w:sz w:val="20"/>
                 <w:szCs w:val="20"/>
               </w:rPr>
-              <w:t>Customer CLV</w:t>
-            </w:r>
-          </w:p>
-        </w:tc>
-        <w:tc>
-          <w:tcPr>
-            <w:tcW w:w="2200" w:type="dxa"/>
+              <w:t>Net Revenue</w:t>
+            </w:r>
+          </w:p>
+        </w:tc>
+        <w:tc>
+          <w:tcPr>
+            <w:tcW w:w="2124" w:type="dxa"/>
             <w:tcBorders>
               <w:top w:val="single" w:sz="1" w:space="0" w:color="CCCCCC"/>
               <w:left w:val="single" w:sz="1" w:space="0" w:color="CCCCCC"/>
@@ -7239,13 +6922,13 @@
                 <w:sz w:val="20"/>
                 <w:szCs w:val="20"/>
               </w:rPr>
-              <w:t>Predicted lifetime value per customer</w:t>
-            </w:r>
-          </w:p>
-        </w:tc>
-        <w:tc>
-          <w:tcPr>
-            <w:tcW w:w="2160" w:type="dxa"/>
+              <w:t>Revenue after refunds and cancellations</w:t>
+            </w:r>
+          </w:p>
+        </w:tc>
+        <w:tc>
+          <w:tcPr>
+            <w:tcW w:w="2225" w:type="dxa"/>
             <w:tcBorders>
               <w:top w:val="single" w:sz="1" w:space="0" w:color="CCCCCC"/>
               <w:left w:val="single" w:sz="1" w:space="0" w:color="CCCCCC"/>
@@ -7267,495 +6950,78 @@
                 <w:sz w:val="18"/>
                 <w:szCs w:val="18"/>
               </w:rPr>
-              <w:t>AVG order value × purchase frequency × lifespan</w:t>
-            </w:r>
-          </w:p>
-        </w:tc>
-        <w:tc>
-          <w:tcPr>
-            <w:tcW w:w="1600" w:type="dxa"/>
-            <w:tcBorders>
-              <w:top w:val="single" w:sz="1" w:space="0" w:color="CCCCCC"/>
-              <w:left w:val="single" w:sz="1" w:space="0" w:color="CCCCCC"/>
-              <w:bottom w:val="single" w:sz="1" w:space="0" w:color="CCCCCC"/>
-              <w:right w:val="single" w:sz="1" w:space="0" w:color="CCCCCC"/>
-            </w:tcBorders>
-            <w:shd w:val="clear" w:color="auto" w:fill="F2F2F2"/>
-            <w:tcMar>
-              <w:top w:w="80" w:type="dxa"/>
-              <w:left w:w="140" w:type="dxa"/>
-              <w:bottom w:w="80" w:type="dxa"/>
-              <w:right w:w="140" w:type="dxa"/>
-            </w:tcMar>
-          </w:tcPr>
-          <w:p>
-            <w:r>
-              <w:rPr>
-                <w:color w:val="666666"/>
-                <w:sz w:val="20"/>
-                <w:szCs w:val="20"/>
-              </w:rPr>
-              <w:t>dim_customer</w:t>
-            </w:r>
-          </w:p>
-        </w:tc>
-        <w:tc>
-          <w:tcPr>
-            <w:tcW w:w="1600" w:type="dxa"/>
-            <w:tcBorders>
-              <w:top w:val="single" w:sz="1" w:space="0" w:color="CCCCCC"/>
-              <w:left w:val="single" w:sz="1" w:space="0" w:color="CCCCCC"/>
-              <w:bottom w:val="single" w:sz="1" w:space="0" w:color="CCCCCC"/>
-              <w:right w:val="single" w:sz="1" w:space="0" w:color="CCCCCC"/>
-            </w:tcBorders>
-            <w:shd w:val="clear" w:color="auto" w:fill="F2F2F2"/>
-            <w:tcMar>
-              <w:top w:w="80" w:type="dxa"/>
-              <w:left w:w="140" w:type="dxa"/>
-              <w:bottom w:w="80" w:type="dxa"/>
-              <w:right w:w="140" w:type="dxa"/>
-            </w:tcMar>
-          </w:tcPr>
-          <w:p>
-            <w:r>
-              <w:rPr>
-                <w:color w:val="666666"/>
-                <w:sz w:val="20"/>
-                <w:szCs w:val="20"/>
-              </w:rPr>
-              <w:t>Monthly</w:t>
-            </w:r>
-          </w:p>
-        </w:tc>
-      </w:tr>
-      <w:tr>
-        <w:tblPrEx>
-          <w:tblCellMar>
-            <w:top w:w="0" w:type="dxa"/>
-            <w:bottom w:w="0" w:type="dxa"/>
-          </w:tblCellMar>
-        </w:tblPrEx>
-        <w:tc>
-          <w:tcPr>
-            <w:tcW w:w="1800" w:type="dxa"/>
-            <w:tcBorders>
-              <w:top w:val="single" w:sz="1" w:space="0" w:color="CCCCCC"/>
-              <w:left w:val="single" w:sz="1" w:space="0" w:color="CCCCCC"/>
-              <w:bottom w:val="single" w:sz="1" w:space="0" w:color="CCCCCC"/>
-              <w:right w:val="single" w:sz="1" w:space="0" w:color="CCCCCC"/>
-            </w:tcBorders>
-            <w:shd w:val="clear" w:color="auto" w:fill="D9E8F5"/>
-            <w:tcMar>
-              <w:top w:w="80" w:type="dxa"/>
-              <w:left w:w="140" w:type="dxa"/>
-              <w:bottom w:w="80" w:type="dxa"/>
-              <w:right w:w="140" w:type="dxa"/>
-            </w:tcMar>
-          </w:tcPr>
-          <w:p>
-            <w:r>
-              <w:rPr>
-                <w:b/>
-                <w:bCs/>
-                <w:color w:val="1F3864"/>
-                <w:sz w:val="20"/>
-                <w:szCs w:val="20"/>
-              </w:rPr>
-              <w:t>Churn Rate</w:t>
-            </w:r>
-          </w:p>
-        </w:tc>
-        <w:tc>
-          <w:tcPr>
-            <w:tcW w:w="2200" w:type="dxa"/>
-            <w:tcBorders>
-              <w:top w:val="single" w:sz="1" w:space="0" w:color="CCCCCC"/>
-              <w:left w:val="single" w:sz="1" w:space="0" w:color="CCCCCC"/>
-              <w:bottom w:val="single" w:sz="1" w:space="0" w:color="CCCCCC"/>
-              <w:right w:val="single" w:sz="1" w:space="0" w:color="CCCCCC"/>
-            </w:tcBorders>
-            <w:shd w:val="clear" w:color="auto" w:fill="FFFFFF"/>
-            <w:tcMar>
-              <w:top w:w="80" w:type="dxa"/>
-              <w:left w:w="140" w:type="dxa"/>
-              <w:bottom w:w="80" w:type="dxa"/>
-              <w:right w:w="140" w:type="dxa"/>
-            </w:tcMar>
-          </w:tcPr>
-          <w:p>
-            <w:r>
-              <w:rPr>
-                <w:sz w:val="20"/>
-                <w:szCs w:val="20"/>
-              </w:rPr>
-              <w:t>% customers lost vs prior period</w:t>
-            </w:r>
-          </w:p>
-        </w:tc>
-        <w:tc>
-          <w:tcPr>
-            <w:tcW w:w="2160" w:type="dxa"/>
-            <w:tcBorders>
-              <w:top w:val="single" w:sz="1" w:space="0" w:color="CCCCCC"/>
-              <w:left w:val="single" w:sz="1" w:space="0" w:color="CCCCCC"/>
-              <w:bottom w:val="single" w:sz="1" w:space="0" w:color="CCCCCC"/>
-              <w:right w:val="single" w:sz="1" w:space="0" w:color="CCCCCC"/>
-            </w:tcBorders>
-            <w:shd w:val="clear" w:color="auto" w:fill="FFFFFF"/>
-            <w:tcMar>
-              <w:top w:w="80" w:type="dxa"/>
-              <w:left w:w="140" w:type="dxa"/>
-              <w:bottom w:w="80" w:type="dxa"/>
-              <w:right w:w="140" w:type="dxa"/>
-            </w:tcMar>
-          </w:tcPr>
-          <w:p>
+              <w:t xml:space="preserve">Total Revenue − </w:t>
+            </w:r>
+            <w:proofErr w:type="gramStart"/>
             <w:r>
               <w:rPr>
                 <w:rFonts w:ascii="Courier New" w:eastAsia="Courier New" w:hAnsi="Courier New" w:cs="Courier New"/>
                 <w:sz w:val="18"/>
                 <w:szCs w:val="18"/>
               </w:rPr>
-              <w:t>(Lost customers / Start customers) × 100</w:t>
-            </w:r>
-          </w:p>
-        </w:tc>
-        <w:tc>
-          <w:tcPr>
-            <w:tcW w:w="1600" w:type="dxa"/>
-            <w:tcBorders>
-              <w:top w:val="single" w:sz="1" w:space="0" w:color="CCCCCC"/>
-              <w:left w:val="single" w:sz="1" w:space="0" w:color="CCCCCC"/>
-              <w:bottom w:val="single" w:sz="1" w:space="0" w:color="CCCCCC"/>
-              <w:right w:val="single" w:sz="1" w:space="0" w:color="CCCCCC"/>
-            </w:tcBorders>
-            <w:shd w:val="clear" w:color="auto" w:fill="FFFFFF"/>
-            <w:tcMar>
-              <w:top w:w="80" w:type="dxa"/>
-              <w:left w:w="140" w:type="dxa"/>
-              <w:bottom w:w="80" w:type="dxa"/>
-              <w:right w:w="140" w:type="dxa"/>
-            </w:tcMar>
-          </w:tcPr>
-          <w:p>
-            <w:r>
-              <w:rPr>
-                <w:color w:val="666666"/>
-                <w:sz w:val="20"/>
-                <w:szCs w:val="20"/>
-              </w:rPr>
-              <w:t>dim_customer</w:t>
-            </w:r>
-          </w:p>
-        </w:tc>
-        <w:tc>
-          <w:tcPr>
-            <w:tcW w:w="1600" w:type="dxa"/>
-            <w:tcBorders>
-              <w:top w:val="single" w:sz="1" w:space="0" w:color="CCCCCC"/>
-              <w:left w:val="single" w:sz="1" w:space="0" w:color="CCCCCC"/>
-              <w:bottom w:val="single" w:sz="1" w:space="0" w:color="CCCCCC"/>
-              <w:right w:val="single" w:sz="1" w:space="0" w:color="CCCCCC"/>
-            </w:tcBorders>
-            <w:shd w:val="clear" w:color="auto" w:fill="FFFFFF"/>
-            <w:tcMar>
-              <w:top w:w="80" w:type="dxa"/>
-              <w:left w:w="140" w:type="dxa"/>
-              <w:bottom w:w="80" w:type="dxa"/>
-              <w:right w:w="140" w:type="dxa"/>
-            </w:tcMar>
-          </w:tcPr>
-          <w:p>
-            <w:r>
-              <w:rPr>
-                <w:color w:val="666666"/>
-                <w:sz w:val="20"/>
-                <w:szCs w:val="20"/>
-              </w:rPr>
-              <w:t>Monthly</w:t>
-            </w:r>
-          </w:p>
-        </w:tc>
-      </w:tr>
-      <w:tr>
-        <w:tblPrEx>
-          <w:tblCellMar>
-            <w:top w:w="0" w:type="dxa"/>
-            <w:bottom w:w="0" w:type="dxa"/>
-          </w:tblCellMar>
-        </w:tblPrEx>
-        <w:tc>
-          <w:tcPr>
-            <w:tcW w:w="1800" w:type="dxa"/>
-            <w:tcBorders>
-              <w:top w:val="single" w:sz="1" w:space="0" w:color="CCCCCC"/>
-              <w:left w:val="single" w:sz="1" w:space="0" w:color="CCCCCC"/>
-              <w:bottom w:val="single" w:sz="1" w:space="0" w:color="CCCCCC"/>
-              <w:right w:val="single" w:sz="1" w:space="0" w:color="CCCCCC"/>
-            </w:tcBorders>
-            <w:shd w:val="clear" w:color="auto" w:fill="D9E8F5"/>
-            <w:tcMar>
-              <w:top w:w="80" w:type="dxa"/>
-              <w:left w:w="140" w:type="dxa"/>
-              <w:bottom w:w="80" w:type="dxa"/>
-              <w:right w:w="140" w:type="dxa"/>
-            </w:tcMar>
-          </w:tcPr>
-          <w:p>
-            <w:r>
-              <w:rPr>
-                <w:b/>
-                <w:bCs/>
-                <w:color w:val="1F3864"/>
-                <w:sz w:val="20"/>
-                <w:szCs w:val="20"/>
-              </w:rPr>
-              <w:t>Return Rate</w:t>
-            </w:r>
-          </w:p>
-        </w:tc>
-        <w:tc>
-          <w:tcPr>
-            <w:tcW w:w="2200" w:type="dxa"/>
-            <w:tcBorders>
-              <w:top w:val="single" w:sz="1" w:space="0" w:color="CCCCCC"/>
-              <w:left w:val="single" w:sz="1" w:space="0" w:color="CCCCCC"/>
-              <w:bottom w:val="single" w:sz="1" w:space="0" w:color="CCCCCC"/>
-              <w:right w:val="single" w:sz="1" w:space="0" w:color="CCCCCC"/>
-            </w:tcBorders>
-            <w:shd w:val="clear" w:color="auto" w:fill="F2F2F2"/>
-            <w:tcMar>
-              <w:top w:w="80" w:type="dxa"/>
-              <w:left w:w="140" w:type="dxa"/>
-              <w:bottom w:w="80" w:type="dxa"/>
-              <w:right w:w="140" w:type="dxa"/>
-            </w:tcMar>
-          </w:tcPr>
-          <w:p>
-            <w:r>
-              <w:rPr>
-                <w:sz w:val="20"/>
-                <w:szCs w:val="20"/>
-              </w:rPr>
-              <w:t>% of items returned</w:t>
-            </w:r>
-          </w:p>
-        </w:tc>
-        <w:tc>
-          <w:tcPr>
-            <w:tcW w:w="2160" w:type="dxa"/>
-            <w:tcBorders>
-              <w:top w:val="single" w:sz="1" w:space="0" w:color="CCCCCC"/>
-              <w:left w:val="single" w:sz="1" w:space="0" w:color="CCCCCC"/>
-              <w:bottom w:val="single" w:sz="1" w:space="0" w:color="CCCCCC"/>
-              <w:right w:val="single" w:sz="1" w:space="0" w:color="CCCCCC"/>
-            </w:tcBorders>
-            <w:shd w:val="clear" w:color="auto" w:fill="F2F2F2"/>
-            <w:tcMar>
-              <w:top w:w="80" w:type="dxa"/>
-              <w:left w:w="140" w:type="dxa"/>
-              <w:bottom w:w="80" w:type="dxa"/>
-              <w:right w:w="140" w:type="dxa"/>
-            </w:tcMar>
-          </w:tcPr>
-          <w:p>
+              <w:t>SUM(</w:t>
+            </w:r>
+            <w:proofErr w:type="spellStart"/>
+            <w:proofErr w:type="gramEnd"/>
             <w:r>
               <w:rPr>
                 <w:rFonts w:ascii="Courier New" w:eastAsia="Courier New" w:hAnsi="Courier New" w:cs="Courier New"/>
                 <w:sz w:val="18"/>
                 <w:szCs w:val="18"/>
               </w:rPr>
-              <w:t>Returned qty / Sold qty × 100</w:t>
-            </w:r>
-          </w:p>
-        </w:tc>
-        <w:tc>
-          <w:tcPr>
-            <w:tcW w:w="1600" w:type="dxa"/>
-            <w:tcBorders>
-              <w:top w:val="single" w:sz="1" w:space="0" w:color="CCCCCC"/>
-              <w:left w:val="single" w:sz="1" w:space="0" w:color="CCCCCC"/>
-              <w:bottom w:val="single" w:sz="1" w:space="0" w:color="CCCCCC"/>
-              <w:right w:val="single" w:sz="1" w:space="0" w:color="CCCCCC"/>
-            </w:tcBorders>
-            <w:shd w:val="clear" w:color="auto" w:fill="F2F2F2"/>
-            <w:tcMar>
-              <w:top w:w="80" w:type="dxa"/>
-              <w:left w:w="140" w:type="dxa"/>
-              <w:bottom w:w="80" w:type="dxa"/>
-              <w:right w:w="140" w:type="dxa"/>
-            </w:tcMar>
-          </w:tcPr>
-          <w:p>
-            <w:r>
-              <w:rPr>
-                <w:color w:val="666666"/>
-                <w:sz w:val="20"/>
-                <w:szCs w:val="20"/>
-              </w:rPr>
-              <w:t>fact_sales</w:t>
-            </w:r>
-          </w:p>
-        </w:tc>
-        <w:tc>
-          <w:tcPr>
-            <w:tcW w:w="1600" w:type="dxa"/>
-            <w:tcBorders>
-              <w:top w:val="single" w:sz="1" w:space="0" w:color="CCCCCC"/>
-              <w:left w:val="single" w:sz="1" w:space="0" w:color="CCCCCC"/>
-              <w:bottom w:val="single" w:sz="1" w:space="0" w:color="CCCCCC"/>
-              <w:right w:val="single" w:sz="1" w:space="0" w:color="CCCCCC"/>
-            </w:tcBorders>
-            <w:shd w:val="clear" w:color="auto" w:fill="F2F2F2"/>
-            <w:tcMar>
-              <w:top w:w="80" w:type="dxa"/>
-              <w:left w:w="140" w:type="dxa"/>
-              <w:bottom w:w="80" w:type="dxa"/>
-              <w:right w:w="140" w:type="dxa"/>
-            </w:tcMar>
-          </w:tcPr>
-          <w:p>
-            <w:r>
-              <w:rPr>
-                <w:color w:val="666666"/>
-                <w:sz w:val="20"/>
-                <w:szCs w:val="20"/>
-              </w:rPr>
-              <w:t>Daily</w:t>
-            </w:r>
-          </w:p>
-        </w:tc>
-      </w:tr>
-      <w:tr>
-        <w:tblPrEx>
-          <w:tblCellMar>
-            <w:top w:w="0" w:type="dxa"/>
-            <w:bottom w:w="0" w:type="dxa"/>
-          </w:tblCellMar>
-        </w:tblPrEx>
-        <w:tc>
-          <w:tcPr>
-            <w:tcW w:w="1800" w:type="dxa"/>
-            <w:tcBorders>
-              <w:top w:val="single" w:sz="1" w:space="0" w:color="CCCCCC"/>
-              <w:left w:val="single" w:sz="1" w:space="0" w:color="CCCCCC"/>
-              <w:bottom w:val="single" w:sz="1" w:space="0" w:color="CCCCCC"/>
-              <w:right w:val="single" w:sz="1" w:space="0" w:color="CCCCCC"/>
-            </w:tcBorders>
-            <w:shd w:val="clear" w:color="auto" w:fill="D9E8F5"/>
-            <w:tcMar>
-              <w:top w:w="80" w:type="dxa"/>
-              <w:left w:w="140" w:type="dxa"/>
-              <w:bottom w:w="80" w:type="dxa"/>
-              <w:right w:w="140" w:type="dxa"/>
-            </w:tcMar>
-          </w:tcPr>
-          <w:p>
-            <w:r>
-              <w:rPr>
-                <w:b/>
-                <w:bCs/>
-                <w:color w:val="1F3864"/>
-                <w:sz w:val="20"/>
-                <w:szCs w:val="20"/>
-              </w:rPr>
-              <w:t>MoM Growth</w:t>
-            </w:r>
-          </w:p>
-        </w:tc>
-        <w:tc>
-          <w:tcPr>
-            <w:tcW w:w="2200" w:type="dxa"/>
-            <w:tcBorders>
-              <w:top w:val="single" w:sz="1" w:space="0" w:color="CCCCCC"/>
-              <w:left w:val="single" w:sz="1" w:space="0" w:color="CCCCCC"/>
-              <w:bottom w:val="single" w:sz="1" w:space="0" w:color="CCCCCC"/>
-              <w:right w:val="single" w:sz="1" w:space="0" w:color="CCCCCC"/>
-            </w:tcBorders>
-            <w:shd w:val="clear" w:color="auto" w:fill="FFFFFF"/>
-            <w:tcMar>
-              <w:top w:w="80" w:type="dxa"/>
-              <w:left w:w="140" w:type="dxa"/>
-              <w:bottom w:w="80" w:type="dxa"/>
-              <w:right w:w="140" w:type="dxa"/>
-            </w:tcMar>
-          </w:tcPr>
-          <w:p>
-            <w:r>
-              <w:rPr>
-                <w:sz w:val="20"/>
-                <w:szCs w:val="20"/>
-              </w:rPr>
-              <w:t>Month-over-month revenue change</w:t>
-            </w:r>
-          </w:p>
-        </w:tc>
-        <w:tc>
-          <w:tcPr>
-            <w:tcW w:w="2160" w:type="dxa"/>
-            <w:tcBorders>
-              <w:top w:val="single" w:sz="1" w:space="0" w:color="CCCCCC"/>
-              <w:left w:val="single" w:sz="1" w:space="0" w:color="CCCCCC"/>
-              <w:bottom w:val="single" w:sz="1" w:space="0" w:color="CCCCCC"/>
-              <w:right w:val="single" w:sz="1" w:space="0" w:color="CCCCCC"/>
-            </w:tcBorders>
-            <w:shd w:val="clear" w:color="auto" w:fill="FFFFFF"/>
-            <w:tcMar>
-              <w:top w:w="80" w:type="dxa"/>
-              <w:left w:w="140" w:type="dxa"/>
-              <w:bottom w:w="80" w:type="dxa"/>
-              <w:right w:w="140" w:type="dxa"/>
-            </w:tcMar>
-          </w:tcPr>
-          <w:p>
+              <w:t>refund_amount</w:t>
+            </w:r>
+            <w:proofErr w:type="spellEnd"/>
             <w:r>
               <w:rPr>
                 <w:rFonts w:ascii="Courier New" w:eastAsia="Courier New" w:hAnsi="Courier New" w:cs="Courier New"/>
                 <w:sz w:val="18"/>
                 <w:szCs w:val="18"/>
               </w:rPr>
-              <w:t>(This month − Last month) / Last month × 100</w:t>
-            </w:r>
-          </w:p>
-        </w:tc>
-        <w:tc>
-          <w:tcPr>
-            <w:tcW w:w="1600" w:type="dxa"/>
-            <w:tcBorders>
-              <w:top w:val="single" w:sz="1" w:space="0" w:color="CCCCCC"/>
-              <w:left w:val="single" w:sz="1" w:space="0" w:color="CCCCCC"/>
-              <w:bottom w:val="single" w:sz="1" w:space="0" w:color="CCCCCC"/>
-              <w:right w:val="single" w:sz="1" w:space="0" w:color="CCCCCC"/>
-            </w:tcBorders>
-            <w:shd w:val="clear" w:color="auto" w:fill="FFFFFF"/>
-            <w:tcMar>
-              <w:top w:w="80" w:type="dxa"/>
-              <w:left w:w="140" w:type="dxa"/>
-              <w:bottom w:w="80" w:type="dxa"/>
-              <w:right w:w="140" w:type="dxa"/>
-            </w:tcMar>
-          </w:tcPr>
-          <w:p>
+              <w:t>)</w:t>
+            </w:r>
+          </w:p>
+        </w:tc>
+        <w:tc>
+          <w:tcPr>
+            <w:tcW w:w="1726" w:type="dxa"/>
+            <w:tcBorders>
+              <w:top w:val="single" w:sz="1" w:space="0" w:color="CCCCCC"/>
+              <w:left w:val="single" w:sz="1" w:space="0" w:color="CCCCCC"/>
+              <w:bottom w:val="single" w:sz="1" w:space="0" w:color="CCCCCC"/>
+              <w:right w:val="single" w:sz="1" w:space="0" w:color="CCCCCC"/>
+            </w:tcBorders>
+            <w:shd w:val="clear" w:color="auto" w:fill="F2F2F2"/>
+            <w:tcMar>
+              <w:top w:w="80" w:type="dxa"/>
+              <w:left w:w="140" w:type="dxa"/>
+              <w:bottom w:w="80" w:type="dxa"/>
+              <w:right w:w="140" w:type="dxa"/>
+            </w:tcMar>
+          </w:tcPr>
+          <w:p>
+            <w:proofErr w:type="spellStart"/>
             <w:r>
               <w:rPr>
                 <w:color w:val="666666"/>
                 <w:sz w:val="20"/>
                 <w:szCs w:val="20"/>
               </w:rPr>
-              <w:t>vw_kpi_revenue</w:t>
-            </w:r>
-          </w:p>
-        </w:tc>
-        <w:tc>
-          <w:tcPr>
-            <w:tcW w:w="1600" w:type="dxa"/>
-            <w:tcBorders>
-              <w:top w:val="single" w:sz="1" w:space="0" w:color="CCCCCC"/>
-              <w:left w:val="single" w:sz="1" w:space="0" w:color="CCCCCC"/>
-              <w:bottom w:val="single" w:sz="1" w:space="0" w:color="CCCCCC"/>
-              <w:right w:val="single" w:sz="1" w:space="0" w:color="CCCCCC"/>
-            </w:tcBorders>
-            <w:shd w:val="clear" w:color="auto" w:fill="FFFFFF"/>
+              <w:t>fact_sales</w:t>
+            </w:r>
+            <w:proofErr w:type="spellEnd"/>
+          </w:p>
+        </w:tc>
+        <w:tc>
+          <w:tcPr>
+            <w:tcW w:w="1543" w:type="dxa"/>
+            <w:tcBorders>
+              <w:top w:val="single" w:sz="1" w:space="0" w:color="CCCCCC"/>
+              <w:left w:val="single" w:sz="1" w:space="0" w:color="CCCCCC"/>
+              <w:bottom w:val="single" w:sz="1" w:space="0" w:color="CCCCCC"/>
+              <w:right w:val="single" w:sz="1" w:space="0" w:color="CCCCCC"/>
+            </w:tcBorders>
+            <w:shd w:val="clear" w:color="auto" w:fill="F2F2F2"/>
             <w:tcMar>
               <w:top w:w="80" w:type="dxa"/>
               <w:left w:w="140" w:type="dxa"/>
@@ -7770,21 +7036,15 @@
                 <w:sz w:val="20"/>
                 <w:szCs w:val="20"/>
               </w:rPr>
-              <w:t>Monthly</w:t>
+              <w:t>Daily</w:t>
             </w:r>
           </w:p>
         </w:tc>
       </w:tr>
       <w:tr>
-        <w:tblPrEx>
-          <w:tblCellMar>
-            <w:top w:w="0" w:type="dxa"/>
-            <w:bottom w:w="0" w:type="dxa"/>
-          </w:tblCellMar>
-        </w:tblPrEx>
-        <w:tc>
-          <w:tcPr>
-            <w:tcW w:w="1800" w:type="dxa"/>
+        <w:tc>
+          <w:tcPr>
+            <w:tcW w:w="1742" w:type="dxa"/>
             <w:tcBorders>
               <w:top w:val="single" w:sz="1" w:space="0" w:color="CCCCCC"/>
               <w:left w:val="single" w:sz="1" w:space="0" w:color="CCCCCC"/>
@@ -7808,47 +7068,47 @@
                 <w:sz w:val="20"/>
                 <w:szCs w:val="20"/>
               </w:rPr>
-              <w:t>DQ Pass Rate</w:t>
-            </w:r>
-          </w:p>
-        </w:tc>
-        <w:tc>
-          <w:tcPr>
-            <w:tcW w:w="2200" w:type="dxa"/>
-            <w:tcBorders>
-              <w:top w:val="single" w:sz="1" w:space="0" w:color="CCCCCC"/>
-              <w:left w:val="single" w:sz="1" w:space="0" w:color="CCCCCC"/>
-              <w:bottom w:val="single" w:sz="1" w:space="0" w:color="CCCCCC"/>
-              <w:right w:val="single" w:sz="1" w:space="0" w:color="CCCCCC"/>
-            </w:tcBorders>
-            <w:shd w:val="clear" w:color="auto" w:fill="F2F2F2"/>
-            <w:tcMar>
-              <w:top w:w="80" w:type="dxa"/>
-              <w:left w:w="140" w:type="dxa"/>
-              <w:bottom w:w="80" w:type="dxa"/>
-              <w:right w:w="140" w:type="dxa"/>
-            </w:tcMar>
-          </w:tcPr>
-          <w:p>
-            <w:r>
-              <w:rPr>
-                <w:sz w:val="20"/>
-                <w:szCs w:val="20"/>
-              </w:rPr>
-              <w:t>% of automated data quality checks passing</w:t>
-            </w:r>
-          </w:p>
-        </w:tc>
-        <w:tc>
-          <w:tcPr>
-            <w:tcW w:w="2160" w:type="dxa"/>
-            <w:tcBorders>
-              <w:top w:val="single" w:sz="1" w:space="0" w:color="CCCCCC"/>
-              <w:left w:val="single" w:sz="1" w:space="0" w:color="CCCCCC"/>
-              <w:bottom w:val="single" w:sz="1" w:space="0" w:color="CCCCCC"/>
-              <w:right w:val="single" w:sz="1" w:space="0" w:color="CCCCCC"/>
-            </w:tcBorders>
-            <w:shd w:val="clear" w:color="auto" w:fill="F2F2F2"/>
+              <w:t>Gross Margin %</w:t>
+            </w:r>
+          </w:p>
+        </w:tc>
+        <w:tc>
+          <w:tcPr>
+            <w:tcW w:w="2124" w:type="dxa"/>
+            <w:tcBorders>
+              <w:top w:val="single" w:sz="1" w:space="0" w:color="CCCCCC"/>
+              <w:left w:val="single" w:sz="1" w:space="0" w:color="CCCCCC"/>
+              <w:bottom w:val="single" w:sz="1" w:space="0" w:color="CCCCCC"/>
+              <w:right w:val="single" w:sz="1" w:space="0" w:color="CCCCCC"/>
+            </w:tcBorders>
+            <w:shd w:val="clear" w:color="auto" w:fill="FFFFFF"/>
+            <w:tcMar>
+              <w:top w:w="80" w:type="dxa"/>
+              <w:left w:w="140" w:type="dxa"/>
+              <w:bottom w:w="80" w:type="dxa"/>
+              <w:right w:w="140" w:type="dxa"/>
+            </w:tcMar>
+          </w:tcPr>
+          <w:p>
+            <w:r>
+              <w:rPr>
+                <w:sz w:val="20"/>
+                <w:szCs w:val="20"/>
+              </w:rPr>
+              <w:t>Profitability as % of revenue</w:t>
+            </w:r>
+          </w:p>
+        </w:tc>
+        <w:tc>
+          <w:tcPr>
+            <w:tcW w:w="2225" w:type="dxa"/>
+            <w:tcBorders>
+              <w:top w:val="single" w:sz="1" w:space="0" w:color="CCCCCC"/>
+              <w:left w:val="single" w:sz="1" w:space="0" w:color="CCCCCC"/>
+              <w:bottom w:val="single" w:sz="1" w:space="0" w:color="CCCCCC"/>
+              <w:right w:val="single" w:sz="1" w:space="0" w:color="CCCCCC"/>
+            </w:tcBorders>
+            <w:shd w:val="clear" w:color="auto" w:fill="FFFFFF"/>
             <w:tcMar>
               <w:top w:w="80" w:type="dxa"/>
               <w:left w:w="140" w:type="dxa"/>
@@ -7863,13 +7123,611 @@
                 <w:sz w:val="18"/>
                 <w:szCs w:val="18"/>
               </w:rPr>
+              <w:t>(Revenue − COGS) / Revenue × 100</w:t>
+            </w:r>
+          </w:p>
+        </w:tc>
+        <w:tc>
+          <w:tcPr>
+            <w:tcW w:w="1726" w:type="dxa"/>
+            <w:tcBorders>
+              <w:top w:val="single" w:sz="1" w:space="0" w:color="CCCCCC"/>
+              <w:left w:val="single" w:sz="1" w:space="0" w:color="CCCCCC"/>
+              <w:bottom w:val="single" w:sz="1" w:space="0" w:color="CCCCCC"/>
+              <w:right w:val="single" w:sz="1" w:space="0" w:color="CCCCCC"/>
+            </w:tcBorders>
+            <w:shd w:val="clear" w:color="auto" w:fill="FFFFFF"/>
+            <w:tcMar>
+              <w:top w:w="80" w:type="dxa"/>
+              <w:left w:w="140" w:type="dxa"/>
+              <w:bottom w:w="80" w:type="dxa"/>
+              <w:right w:w="140" w:type="dxa"/>
+            </w:tcMar>
+          </w:tcPr>
+          <w:p>
+            <w:proofErr w:type="spellStart"/>
+            <w:r>
+              <w:rPr>
+                <w:color w:val="666666"/>
+                <w:sz w:val="20"/>
+                <w:szCs w:val="20"/>
+              </w:rPr>
+              <w:t>fact_sales</w:t>
+            </w:r>
+            <w:proofErr w:type="spellEnd"/>
+            <w:r>
+              <w:rPr>
+                <w:color w:val="666666"/>
+                <w:sz w:val="20"/>
+                <w:szCs w:val="20"/>
+              </w:rPr>
+              <w:t xml:space="preserve"> + </w:t>
+            </w:r>
+            <w:proofErr w:type="spellStart"/>
+            <w:r>
+              <w:rPr>
+                <w:color w:val="666666"/>
+                <w:sz w:val="20"/>
+                <w:szCs w:val="20"/>
+              </w:rPr>
+              <w:t>dim_product</w:t>
+            </w:r>
+            <w:proofErr w:type="spellEnd"/>
+          </w:p>
+        </w:tc>
+        <w:tc>
+          <w:tcPr>
+            <w:tcW w:w="1543" w:type="dxa"/>
+            <w:tcBorders>
+              <w:top w:val="single" w:sz="1" w:space="0" w:color="CCCCCC"/>
+              <w:left w:val="single" w:sz="1" w:space="0" w:color="CCCCCC"/>
+              <w:bottom w:val="single" w:sz="1" w:space="0" w:color="CCCCCC"/>
+              <w:right w:val="single" w:sz="1" w:space="0" w:color="CCCCCC"/>
+            </w:tcBorders>
+            <w:shd w:val="clear" w:color="auto" w:fill="FFFFFF"/>
+            <w:tcMar>
+              <w:top w:w="80" w:type="dxa"/>
+              <w:left w:w="140" w:type="dxa"/>
+              <w:bottom w:w="80" w:type="dxa"/>
+              <w:right w:w="140" w:type="dxa"/>
+            </w:tcMar>
+          </w:tcPr>
+          <w:p>
+            <w:r>
+              <w:rPr>
+                <w:color w:val="666666"/>
+                <w:sz w:val="20"/>
+                <w:szCs w:val="20"/>
+              </w:rPr>
+              <w:t>Daily</w:t>
+            </w:r>
+          </w:p>
+        </w:tc>
+      </w:tr>
+      <w:tr>
+        <w:tc>
+          <w:tcPr>
+            <w:tcW w:w="1742" w:type="dxa"/>
+            <w:tcBorders>
+              <w:top w:val="single" w:sz="1" w:space="0" w:color="CCCCCC"/>
+              <w:left w:val="single" w:sz="1" w:space="0" w:color="CCCCCC"/>
+              <w:bottom w:val="single" w:sz="1" w:space="0" w:color="CCCCCC"/>
+              <w:right w:val="single" w:sz="1" w:space="0" w:color="CCCCCC"/>
+            </w:tcBorders>
+            <w:shd w:val="clear" w:color="auto" w:fill="D9E8F5"/>
+            <w:tcMar>
+              <w:top w:w="80" w:type="dxa"/>
+              <w:left w:w="140" w:type="dxa"/>
+              <w:bottom w:w="80" w:type="dxa"/>
+              <w:right w:w="140" w:type="dxa"/>
+            </w:tcMar>
+          </w:tcPr>
+          <w:p>
+            <w:r>
+              <w:rPr>
+                <w:b/>
+                <w:bCs/>
+                <w:color w:val="1F3864"/>
+                <w:sz w:val="20"/>
+                <w:szCs w:val="20"/>
+              </w:rPr>
+              <w:t>Customer CLV</w:t>
+            </w:r>
+          </w:p>
+        </w:tc>
+        <w:tc>
+          <w:tcPr>
+            <w:tcW w:w="2124" w:type="dxa"/>
+            <w:tcBorders>
+              <w:top w:val="single" w:sz="1" w:space="0" w:color="CCCCCC"/>
+              <w:left w:val="single" w:sz="1" w:space="0" w:color="CCCCCC"/>
+              <w:bottom w:val="single" w:sz="1" w:space="0" w:color="CCCCCC"/>
+              <w:right w:val="single" w:sz="1" w:space="0" w:color="CCCCCC"/>
+            </w:tcBorders>
+            <w:shd w:val="clear" w:color="auto" w:fill="F2F2F2"/>
+            <w:tcMar>
+              <w:top w:w="80" w:type="dxa"/>
+              <w:left w:w="140" w:type="dxa"/>
+              <w:bottom w:w="80" w:type="dxa"/>
+              <w:right w:w="140" w:type="dxa"/>
+            </w:tcMar>
+          </w:tcPr>
+          <w:p>
+            <w:r>
+              <w:rPr>
+                <w:sz w:val="20"/>
+                <w:szCs w:val="20"/>
+              </w:rPr>
+              <w:t>Predicted lifetime value per customer</w:t>
+            </w:r>
+          </w:p>
+        </w:tc>
+        <w:tc>
+          <w:tcPr>
+            <w:tcW w:w="2225" w:type="dxa"/>
+            <w:tcBorders>
+              <w:top w:val="single" w:sz="1" w:space="0" w:color="CCCCCC"/>
+              <w:left w:val="single" w:sz="1" w:space="0" w:color="CCCCCC"/>
+              <w:bottom w:val="single" w:sz="1" w:space="0" w:color="CCCCCC"/>
+              <w:right w:val="single" w:sz="1" w:space="0" w:color="CCCCCC"/>
+            </w:tcBorders>
+            <w:shd w:val="clear" w:color="auto" w:fill="F2F2F2"/>
+            <w:tcMar>
+              <w:top w:w="80" w:type="dxa"/>
+              <w:left w:w="140" w:type="dxa"/>
+              <w:bottom w:w="80" w:type="dxa"/>
+              <w:right w:w="140" w:type="dxa"/>
+            </w:tcMar>
+          </w:tcPr>
+          <w:p>
+            <w:r>
+              <w:rPr>
+                <w:rFonts w:ascii="Courier New" w:eastAsia="Courier New" w:hAnsi="Courier New" w:cs="Courier New"/>
+                <w:sz w:val="18"/>
+                <w:szCs w:val="18"/>
+              </w:rPr>
+              <w:t>AVG order value × purchase frequency × lifespan</w:t>
+            </w:r>
+          </w:p>
+        </w:tc>
+        <w:tc>
+          <w:tcPr>
+            <w:tcW w:w="1726" w:type="dxa"/>
+            <w:tcBorders>
+              <w:top w:val="single" w:sz="1" w:space="0" w:color="CCCCCC"/>
+              <w:left w:val="single" w:sz="1" w:space="0" w:color="CCCCCC"/>
+              <w:bottom w:val="single" w:sz="1" w:space="0" w:color="CCCCCC"/>
+              <w:right w:val="single" w:sz="1" w:space="0" w:color="CCCCCC"/>
+            </w:tcBorders>
+            <w:shd w:val="clear" w:color="auto" w:fill="F2F2F2"/>
+            <w:tcMar>
+              <w:top w:w="80" w:type="dxa"/>
+              <w:left w:w="140" w:type="dxa"/>
+              <w:bottom w:w="80" w:type="dxa"/>
+              <w:right w:w="140" w:type="dxa"/>
+            </w:tcMar>
+          </w:tcPr>
+          <w:p>
+            <w:proofErr w:type="spellStart"/>
+            <w:r>
+              <w:rPr>
+                <w:color w:val="666666"/>
+                <w:sz w:val="20"/>
+                <w:szCs w:val="20"/>
+              </w:rPr>
+              <w:t>dim_customer</w:t>
+            </w:r>
+            <w:proofErr w:type="spellEnd"/>
+          </w:p>
+        </w:tc>
+        <w:tc>
+          <w:tcPr>
+            <w:tcW w:w="1543" w:type="dxa"/>
+            <w:tcBorders>
+              <w:top w:val="single" w:sz="1" w:space="0" w:color="CCCCCC"/>
+              <w:left w:val="single" w:sz="1" w:space="0" w:color="CCCCCC"/>
+              <w:bottom w:val="single" w:sz="1" w:space="0" w:color="CCCCCC"/>
+              <w:right w:val="single" w:sz="1" w:space="0" w:color="CCCCCC"/>
+            </w:tcBorders>
+            <w:shd w:val="clear" w:color="auto" w:fill="F2F2F2"/>
+            <w:tcMar>
+              <w:top w:w="80" w:type="dxa"/>
+              <w:left w:w="140" w:type="dxa"/>
+              <w:bottom w:w="80" w:type="dxa"/>
+              <w:right w:w="140" w:type="dxa"/>
+            </w:tcMar>
+          </w:tcPr>
+          <w:p>
+            <w:r>
+              <w:rPr>
+                <w:color w:val="666666"/>
+                <w:sz w:val="20"/>
+                <w:szCs w:val="20"/>
+              </w:rPr>
+              <w:t>Monthly</w:t>
+            </w:r>
+          </w:p>
+        </w:tc>
+      </w:tr>
+      <w:tr>
+        <w:tc>
+          <w:tcPr>
+            <w:tcW w:w="1742" w:type="dxa"/>
+            <w:tcBorders>
+              <w:top w:val="single" w:sz="1" w:space="0" w:color="CCCCCC"/>
+              <w:left w:val="single" w:sz="1" w:space="0" w:color="CCCCCC"/>
+              <w:bottom w:val="single" w:sz="1" w:space="0" w:color="CCCCCC"/>
+              <w:right w:val="single" w:sz="1" w:space="0" w:color="CCCCCC"/>
+            </w:tcBorders>
+            <w:shd w:val="clear" w:color="auto" w:fill="D9E8F5"/>
+            <w:tcMar>
+              <w:top w:w="80" w:type="dxa"/>
+              <w:left w:w="140" w:type="dxa"/>
+              <w:bottom w:w="80" w:type="dxa"/>
+              <w:right w:w="140" w:type="dxa"/>
+            </w:tcMar>
+          </w:tcPr>
+          <w:p>
+            <w:r>
+              <w:rPr>
+                <w:b/>
+                <w:bCs/>
+                <w:color w:val="1F3864"/>
+                <w:sz w:val="20"/>
+                <w:szCs w:val="20"/>
+              </w:rPr>
+              <w:t>Churn Rate</w:t>
+            </w:r>
+          </w:p>
+        </w:tc>
+        <w:tc>
+          <w:tcPr>
+            <w:tcW w:w="2124" w:type="dxa"/>
+            <w:tcBorders>
+              <w:top w:val="single" w:sz="1" w:space="0" w:color="CCCCCC"/>
+              <w:left w:val="single" w:sz="1" w:space="0" w:color="CCCCCC"/>
+              <w:bottom w:val="single" w:sz="1" w:space="0" w:color="CCCCCC"/>
+              <w:right w:val="single" w:sz="1" w:space="0" w:color="CCCCCC"/>
+            </w:tcBorders>
+            <w:shd w:val="clear" w:color="auto" w:fill="FFFFFF"/>
+            <w:tcMar>
+              <w:top w:w="80" w:type="dxa"/>
+              <w:left w:w="140" w:type="dxa"/>
+              <w:bottom w:w="80" w:type="dxa"/>
+              <w:right w:w="140" w:type="dxa"/>
+            </w:tcMar>
+          </w:tcPr>
+          <w:p>
+            <w:r>
+              <w:rPr>
+                <w:sz w:val="20"/>
+                <w:szCs w:val="20"/>
+              </w:rPr>
+              <w:t>% customers lost vs prior period</w:t>
+            </w:r>
+          </w:p>
+        </w:tc>
+        <w:tc>
+          <w:tcPr>
+            <w:tcW w:w="2225" w:type="dxa"/>
+            <w:tcBorders>
+              <w:top w:val="single" w:sz="1" w:space="0" w:color="CCCCCC"/>
+              <w:left w:val="single" w:sz="1" w:space="0" w:color="CCCCCC"/>
+              <w:bottom w:val="single" w:sz="1" w:space="0" w:color="CCCCCC"/>
+              <w:right w:val="single" w:sz="1" w:space="0" w:color="CCCCCC"/>
+            </w:tcBorders>
+            <w:shd w:val="clear" w:color="auto" w:fill="FFFFFF"/>
+            <w:tcMar>
+              <w:top w:w="80" w:type="dxa"/>
+              <w:left w:w="140" w:type="dxa"/>
+              <w:bottom w:w="80" w:type="dxa"/>
+              <w:right w:w="140" w:type="dxa"/>
+            </w:tcMar>
+          </w:tcPr>
+          <w:p>
+            <w:r>
+              <w:rPr>
+                <w:rFonts w:ascii="Courier New" w:eastAsia="Courier New" w:hAnsi="Courier New" w:cs="Courier New"/>
+                <w:sz w:val="18"/>
+                <w:szCs w:val="18"/>
+              </w:rPr>
+              <w:t>(Lost customers / Start customers) × 100</w:t>
+            </w:r>
+          </w:p>
+        </w:tc>
+        <w:tc>
+          <w:tcPr>
+            <w:tcW w:w="1726" w:type="dxa"/>
+            <w:tcBorders>
+              <w:top w:val="single" w:sz="1" w:space="0" w:color="CCCCCC"/>
+              <w:left w:val="single" w:sz="1" w:space="0" w:color="CCCCCC"/>
+              <w:bottom w:val="single" w:sz="1" w:space="0" w:color="CCCCCC"/>
+              <w:right w:val="single" w:sz="1" w:space="0" w:color="CCCCCC"/>
+            </w:tcBorders>
+            <w:shd w:val="clear" w:color="auto" w:fill="FFFFFF"/>
+            <w:tcMar>
+              <w:top w:w="80" w:type="dxa"/>
+              <w:left w:w="140" w:type="dxa"/>
+              <w:bottom w:w="80" w:type="dxa"/>
+              <w:right w:w="140" w:type="dxa"/>
+            </w:tcMar>
+          </w:tcPr>
+          <w:p>
+            <w:proofErr w:type="spellStart"/>
+            <w:r>
+              <w:rPr>
+                <w:color w:val="666666"/>
+                <w:sz w:val="20"/>
+                <w:szCs w:val="20"/>
+              </w:rPr>
+              <w:t>dim_customer</w:t>
+            </w:r>
+            <w:proofErr w:type="spellEnd"/>
+          </w:p>
+        </w:tc>
+        <w:tc>
+          <w:tcPr>
+            <w:tcW w:w="1543" w:type="dxa"/>
+            <w:tcBorders>
+              <w:top w:val="single" w:sz="1" w:space="0" w:color="CCCCCC"/>
+              <w:left w:val="single" w:sz="1" w:space="0" w:color="CCCCCC"/>
+              <w:bottom w:val="single" w:sz="1" w:space="0" w:color="CCCCCC"/>
+              <w:right w:val="single" w:sz="1" w:space="0" w:color="CCCCCC"/>
+            </w:tcBorders>
+            <w:shd w:val="clear" w:color="auto" w:fill="FFFFFF"/>
+            <w:tcMar>
+              <w:top w:w="80" w:type="dxa"/>
+              <w:left w:w="140" w:type="dxa"/>
+              <w:bottom w:w="80" w:type="dxa"/>
+              <w:right w:w="140" w:type="dxa"/>
+            </w:tcMar>
+          </w:tcPr>
+          <w:p>
+            <w:r>
+              <w:rPr>
+                <w:color w:val="666666"/>
+                <w:sz w:val="20"/>
+                <w:szCs w:val="20"/>
+              </w:rPr>
+              <w:t>Monthly</w:t>
+            </w:r>
+          </w:p>
+        </w:tc>
+      </w:tr>
+      <w:tr>
+        <w:tc>
+          <w:tcPr>
+            <w:tcW w:w="1742" w:type="dxa"/>
+            <w:tcBorders>
+              <w:top w:val="single" w:sz="1" w:space="0" w:color="CCCCCC"/>
+              <w:left w:val="single" w:sz="1" w:space="0" w:color="CCCCCC"/>
+              <w:bottom w:val="single" w:sz="1" w:space="0" w:color="CCCCCC"/>
+              <w:right w:val="single" w:sz="1" w:space="0" w:color="CCCCCC"/>
+            </w:tcBorders>
+            <w:shd w:val="clear" w:color="auto" w:fill="D9E8F5"/>
+            <w:tcMar>
+              <w:top w:w="80" w:type="dxa"/>
+              <w:left w:w="140" w:type="dxa"/>
+              <w:bottom w:w="80" w:type="dxa"/>
+              <w:right w:w="140" w:type="dxa"/>
+            </w:tcMar>
+          </w:tcPr>
+          <w:p>
+            <w:r>
+              <w:rPr>
+                <w:b/>
+                <w:bCs/>
+                <w:color w:val="1F3864"/>
+                <w:sz w:val="20"/>
+                <w:szCs w:val="20"/>
+              </w:rPr>
+              <w:t>MoM Growth</w:t>
+            </w:r>
+          </w:p>
+        </w:tc>
+        <w:tc>
+          <w:tcPr>
+            <w:tcW w:w="2124" w:type="dxa"/>
+            <w:tcBorders>
+              <w:top w:val="single" w:sz="1" w:space="0" w:color="CCCCCC"/>
+              <w:left w:val="single" w:sz="1" w:space="0" w:color="CCCCCC"/>
+              <w:bottom w:val="single" w:sz="1" w:space="0" w:color="CCCCCC"/>
+              <w:right w:val="single" w:sz="1" w:space="0" w:color="CCCCCC"/>
+            </w:tcBorders>
+            <w:shd w:val="clear" w:color="auto" w:fill="FFFFFF"/>
+            <w:tcMar>
+              <w:top w:w="80" w:type="dxa"/>
+              <w:left w:w="140" w:type="dxa"/>
+              <w:bottom w:w="80" w:type="dxa"/>
+              <w:right w:w="140" w:type="dxa"/>
+            </w:tcMar>
+          </w:tcPr>
+          <w:p>
+            <w:r>
+              <w:rPr>
+                <w:sz w:val="20"/>
+                <w:szCs w:val="20"/>
+              </w:rPr>
+              <w:t>Month-over-month revenue change</w:t>
+            </w:r>
+          </w:p>
+        </w:tc>
+        <w:tc>
+          <w:tcPr>
+            <w:tcW w:w="2225" w:type="dxa"/>
+            <w:tcBorders>
+              <w:top w:val="single" w:sz="1" w:space="0" w:color="CCCCCC"/>
+              <w:left w:val="single" w:sz="1" w:space="0" w:color="CCCCCC"/>
+              <w:bottom w:val="single" w:sz="1" w:space="0" w:color="CCCCCC"/>
+              <w:right w:val="single" w:sz="1" w:space="0" w:color="CCCCCC"/>
+            </w:tcBorders>
+            <w:shd w:val="clear" w:color="auto" w:fill="FFFFFF"/>
+            <w:tcMar>
+              <w:top w:w="80" w:type="dxa"/>
+              <w:left w:w="140" w:type="dxa"/>
+              <w:bottom w:w="80" w:type="dxa"/>
+              <w:right w:w="140" w:type="dxa"/>
+            </w:tcMar>
+          </w:tcPr>
+          <w:p>
+            <w:r>
+              <w:rPr>
+                <w:rFonts w:ascii="Courier New" w:eastAsia="Courier New" w:hAnsi="Courier New" w:cs="Courier New"/>
+                <w:sz w:val="18"/>
+                <w:szCs w:val="18"/>
+              </w:rPr>
+              <w:t>(This month − Last month) / Last month × 100</w:t>
+            </w:r>
+          </w:p>
+        </w:tc>
+        <w:tc>
+          <w:tcPr>
+            <w:tcW w:w="1726" w:type="dxa"/>
+            <w:tcBorders>
+              <w:top w:val="single" w:sz="1" w:space="0" w:color="CCCCCC"/>
+              <w:left w:val="single" w:sz="1" w:space="0" w:color="CCCCCC"/>
+              <w:bottom w:val="single" w:sz="1" w:space="0" w:color="CCCCCC"/>
+              <w:right w:val="single" w:sz="1" w:space="0" w:color="CCCCCC"/>
+            </w:tcBorders>
+            <w:shd w:val="clear" w:color="auto" w:fill="FFFFFF"/>
+            <w:tcMar>
+              <w:top w:w="80" w:type="dxa"/>
+              <w:left w:w="140" w:type="dxa"/>
+              <w:bottom w:w="80" w:type="dxa"/>
+              <w:right w:w="140" w:type="dxa"/>
+            </w:tcMar>
+          </w:tcPr>
+          <w:p>
+            <w:proofErr w:type="spellStart"/>
+            <w:r>
+              <w:rPr>
+                <w:color w:val="666666"/>
+                <w:sz w:val="20"/>
+                <w:szCs w:val="20"/>
+              </w:rPr>
+              <w:t>vw_kpi_revenue</w:t>
+            </w:r>
+            <w:proofErr w:type="spellEnd"/>
+          </w:p>
+        </w:tc>
+        <w:tc>
+          <w:tcPr>
+            <w:tcW w:w="1543" w:type="dxa"/>
+            <w:tcBorders>
+              <w:top w:val="single" w:sz="1" w:space="0" w:color="CCCCCC"/>
+              <w:left w:val="single" w:sz="1" w:space="0" w:color="CCCCCC"/>
+              <w:bottom w:val="single" w:sz="1" w:space="0" w:color="CCCCCC"/>
+              <w:right w:val="single" w:sz="1" w:space="0" w:color="CCCCCC"/>
+            </w:tcBorders>
+            <w:shd w:val="clear" w:color="auto" w:fill="FFFFFF"/>
+            <w:tcMar>
+              <w:top w:w="80" w:type="dxa"/>
+              <w:left w:w="140" w:type="dxa"/>
+              <w:bottom w:w="80" w:type="dxa"/>
+              <w:right w:w="140" w:type="dxa"/>
+            </w:tcMar>
+          </w:tcPr>
+          <w:p>
+            <w:r>
+              <w:rPr>
+                <w:color w:val="666666"/>
+                <w:sz w:val="20"/>
+                <w:szCs w:val="20"/>
+              </w:rPr>
+              <w:t>Monthly</w:t>
+            </w:r>
+          </w:p>
+        </w:tc>
+      </w:tr>
+      <w:tr>
+        <w:tc>
+          <w:tcPr>
+            <w:tcW w:w="1742" w:type="dxa"/>
+            <w:tcBorders>
+              <w:top w:val="single" w:sz="1" w:space="0" w:color="CCCCCC"/>
+              <w:left w:val="single" w:sz="1" w:space="0" w:color="CCCCCC"/>
+              <w:bottom w:val="single" w:sz="1" w:space="0" w:color="CCCCCC"/>
+              <w:right w:val="single" w:sz="1" w:space="0" w:color="CCCCCC"/>
+            </w:tcBorders>
+            <w:shd w:val="clear" w:color="auto" w:fill="D9E8F5"/>
+            <w:tcMar>
+              <w:top w:w="80" w:type="dxa"/>
+              <w:left w:w="140" w:type="dxa"/>
+              <w:bottom w:w="80" w:type="dxa"/>
+              <w:right w:w="140" w:type="dxa"/>
+            </w:tcMar>
+          </w:tcPr>
+          <w:p>
+            <w:r>
+              <w:rPr>
+                <w:b/>
+                <w:bCs/>
+                <w:color w:val="1F3864"/>
+                <w:sz w:val="20"/>
+                <w:szCs w:val="20"/>
+              </w:rPr>
+              <w:t>DQ Pass Rate</w:t>
+            </w:r>
+          </w:p>
+        </w:tc>
+        <w:tc>
+          <w:tcPr>
+            <w:tcW w:w="2124" w:type="dxa"/>
+            <w:tcBorders>
+              <w:top w:val="single" w:sz="1" w:space="0" w:color="CCCCCC"/>
+              <w:left w:val="single" w:sz="1" w:space="0" w:color="CCCCCC"/>
+              <w:bottom w:val="single" w:sz="1" w:space="0" w:color="CCCCCC"/>
+              <w:right w:val="single" w:sz="1" w:space="0" w:color="CCCCCC"/>
+            </w:tcBorders>
+            <w:shd w:val="clear" w:color="auto" w:fill="F2F2F2"/>
+            <w:tcMar>
+              <w:top w:w="80" w:type="dxa"/>
+              <w:left w:w="140" w:type="dxa"/>
+              <w:bottom w:w="80" w:type="dxa"/>
+              <w:right w:w="140" w:type="dxa"/>
+            </w:tcMar>
+          </w:tcPr>
+          <w:p>
+            <w:r>
+              <w:rPr>
+                <w:sz w:val="20"/>
+                <w:szCs w:val="20"/>
+              </w:rPr>
+              <w:t>% of automated data quality checks passing</w:t>
+            </w:r>
+          </w:p>
+        </w:tc>
+        <w:tc>
+          <w:tcPr>
+            <w:tcW w:w="2225" w:type="dxa"/>
+            <w:tcBorders>
+              <w:top w:val="single" w:sz="1" w:space="0" w:color="CCCCCC"/>
+              <w:left w:val="single" w:sz="1" w:space="0" w:color="CCCCCC"/>
+              <w:bottom w:val="single" w:sz="1" w:space="0" w:color="CCCCCC"/>
+              <w:right w:val="single" w:sz="1" w:space="0" w:color="CCCCCC"/>
+            </w:tcBorders>
+            <w:shd w:val="clear" w:color="auto" w:fill="F2F2F2"/>
+            <w:tcMar>
+              <w:top w:w="80" w:type="dxa"/>
+              <w:left w:w="140" w:type="dxa"/>
+              <w:bottom w:w="80" w:type="dxa"/>
+              <w:right w:w="140" w:type="dxa"/>
+            </w:tcMar>
+          </w:tcPr>
+          <w:p>
+            <w:r>
+              <w:rPr>
+                <w:rFonts w:ascii="Courier New" w:eastAsia="Courier New" w:hAnsi="Courier New" w:cs="Courier New"/>
+                <w:sz w:val="18"/>
+                <w:szCs w:val="18"/>
+              </w:rPr>
               <w:t>Passing checks / Total checks × 100</w:t>
             </w:r>
           </w:p>
         </w:tc>
         <w:tc>
           <w:tcPr>
-            <w:tcW w:w="1600" w:type="dxa"/>
+            <w:tcW w:w="1726" w:type="dxa"/>
             <w:tcBorders>
               <w:top w:val="single" w:sz="1" w:space="0" w:color="CCCCCC"/>
               <w:left w:val="single" w:sz="1" w:space="0" w:color="CCCCCC"/>
@@ -7885,6 +7743,7 @@
             </w:tcMar>
           </w:tcPr>
           <w:p>
+            <w:proofErr w:type="spellStart"/>
             <w:r>
               <w:rPr>
                 <w:color w:val="666666"/>
@@ -7893,11 +7752,12 @@
               </w:rPr>
               <w:t>dq_results</w:t>
             </w:r>
-          </w:p>
-        </w:tc>
-        <w:tc>
-          <w:tcPr>
-            <w:tcW w:w="1600" w:type="dxa"/>
+            <w:proofErr w:type="spellEnd"/>
+          </w:p>
+        </w:tc>
+        <w:tc>
+          <w:tcPr>
+            <w:tcW w:w="1543" w:type="dxa"/>
             <w:tcBorders>
               <w:top w:val="single" w:sz="1" w:space="0" w:color="CCCCCC"/>
               <w:left w:val="single" w:sz="1" w:space="0" w:color="CCCCCC"/>
@@ -7967,7 +7827,15 @@
         <w:spacing w:before="40" w:after="60"/>
       </w:pPr>
       <w:r>
-        <w:t>Bronze, Silver, and Gold layer build in SQL Server</w:t>
+        <w:t xml:space="preserve">Bronze, Silver, and </w:t>
+      </w:r>
+      <w:proofErr w:type="gramStart"/>
+      <w:r>
+        <w:t>Gold</w:t>
+      </w:r>
+      <w:proofErr w:type="gramEnd"/>
+      <w:r>
+        <w:t xml:space="preserve"> layer build in SQL Server</w:t>
       </w:r>
     </w:p>
     <w:p>
@@ -7979,8 +7847,21 @@
         </w:numPr>
         <w:spacing w:before="40" w:after="60"/>
       </w:pPr>
-      <w:r>
-        <w:t>dbt models for Silver and Gold transformations</w:t>
+      <w:proofErr w:type="spellStart"/>
+      <w:r>
+        <w:t>dbt</w:t>
+      </w:r>
+      <w:proofErr w:type="spellEnd"/>
+      <w:r>
+        <w:t xml:space="preserve"> models for </w:t>
+      </w:r>
+      <w:proofErr w:type="gramStart"/>
+      <w:r>
+        <w:t>Silver and Gold</w:t>
+      </w:r>
+      <w:proofErr w:type="gramEnd"/>
+      <w:r>
+        <w:t xml:space="preserve"> transformations</w:t>
       </w:r>
     </w:p>
     <w:p>
@@ -8019,7 +7900,15 @@
         <w:spacing w:before="40" w:after="60"/>
       </w:pPr>
       <w:r>
-        <w:t>KPI views: Revenue, Customer, Product, Data Quality</w:t>
+        <w:t xml:space="preserve">Executive dashboard (Power BI or </w:t>
+      </w:r>
+      <w:proofErr w:type="spellStart"/>
+      <w:r>
+        <w:t>Streamlit</w:t>
+      </w:r>
+      <w:proofErr w:type="spellEnd"/>
+      <w:r>
+        <w:t xml:space="preserve"> — 3–5 pages)</w:t>
       </w:r>
     </w:p>
     <w:p>
@@ -8032,7 +7921,7 @@
         <w:spacing w:before="40" w:after="60"/>
       </w:pPr>
       <w:r>
-        <w:t>Executive dashboard (Power BI or Streamlit — 3–5 pages)</w:t>
+        <w:t>GitHub repository with CI/CD pipeline (GitHub Actions)</w:t>
       </w:r>
     </w:p>
     <w:p>
@@ -8045,7 +7934,20 @@
         <w:spacing w:before="40" w:after="60"/>
       </w:pPr>
       <w:r>
-        <w:t>GitHub repository with CI/CD pipeline (GitHub Actions)</w:t>
+        <w:t>Full documentation: BRD, data catalog, naming conventions, README</w:t>
+      </w:r>
+    </w:p>
+    <w:p>
+      <w:pPr>
+        <w:spacing w:before="60"/>
+      </w:pPr>
+    </w:p>
+    <w:p>
+      <w:pPr>
+        <w:pStyle w:val="Heading2"/>
+      </w:pPr>
+      <w:r>
+        <w:t>8.2 Out of Scope</w:t>
       </w:r>
     </w:p>
     <w:p>
@@ -8058,21 +7960,7 @@
         <w:spacing w:before="40" w:after="60"/>
       </w:pPr>
       <w:r>
-        <w:t>Full documentation: BRD, data catalog, naming conventions, README</w:t>
-      </w:r>
-    </w:p>
-    <w:p>
-      <w:pPr>
-        <w:spacing w:before="60"/>
-      </w:pPr>
-    </w:p>
-    <w:p>
-      <w:pPr>
-        <w:pStyle w:val="Heading2"/>
-      </w:pPr>
-      <w:r>
-        <w:lastRenderedPageBreak/>
-        <w:t>8.2 Out of Scope</w:t>
+        <w:t>Real-time or streaming data ingestion (batch only)</w:t>
       </w:r>
     </w:p>
     <w:p>
@@ -8085,19 +7973,7 @@
         <w:spacing w:before="40" w:after="60"/>
       </w:pPr>
       <w:r>
-        <w:t>Real-time or streaming data ingestion (batch only)</w:t>
-      </w:r>
-    </w:p>
-    <w:p>
-      <w:pPr>
-        <w:pStyle w:val="ListParagraph"/>
-        <w:numPr>
-          <w:ilvl w:val="0"/>
-          <w:numId w:val="2"/>
-        </w:numPr>
-        <w:spacing w:before="40" w:after="60"/>
-      </w:pPr>
-      <w:r>
+        <w:lastRenderedPageBreak/>
         <w:t>Machine learning or predictive modelling</w:t>
       </w:r>
     </w:p>
@@ -8175,12 +8051,6 @@
         <w:gridCol w:w="7890"/>
       </w:tblGrid>
       <w:tr>
-        <w:tblPrEx>
-          <w:tblCellMar>
-            <w:top w:w="0" w:type="dxa"/>
-            <w:bottom w:w="0" w:type="dxa"/>
-          </w:tblCellMar>
-        </w:tblPrEx>
         <w:tc>
           <w:tcPr>
             <w:tcW w:w="1400" w:type="dxa"/>
@@ -8245,12 +8115,6 @@
         </w:tc>
       </w:tr>
       <w:tr>
-        <w:tblPrEx>
-          <w:tblCellMar>
-            <w:top w:w="0" w:type="dxa"/>
-            <w:bottom w:w="0" w:type="dxa"/>
-          </w:tblCellMar>
-        </w:tblPrEx>
         <w:tc>
           <w:tcPr>
             <w:tcW w:w="1400" w:type="dxa"/>
@@ -8310,12 +8174,6 @@
         </w:tc>
       </w:tr>
       <w:tr>
-        <w:tblPrEx>
-          <w:tblCellMar>
-            <w:top w:w="0" w:type="dxa"/>
-            <w:bottom w:w="0" w:type="dxa"/>
-          </w:tblCellMar>
-        </w:tblPrEx>
         <w:tc>
           <w:tcPr>
             <w:tcW w:w="1400" w:type="dxa"/>
@@ -8375,12 +8233,6 @@
         </w:tc>
       </w:tr>
       <w:tr>
-        <w:tblPrEx>
-          <w:tblCellMar>
-            <w:top w:w="0" w:type="dxa"/>
-            <w:bottom w:w="0" w:type="dxa"/>
-          </w:tblCellMar>
-        </w:tblPrEx>
         <w:tc>
           <w:tcPr>
             <w:tcW w:w="1400" w:type="dxa"/>
@@ -8429,23 +8281,42 @@
             </w:tcMar>
           </w:tcPr>
           <w:p>
-            <w:r>
-              <w:rPr>
-                <w:sz w:val="20"/>
-                <w:szCs w:val="20"/>
-              </w:rPr>
-              <w:t>dbt Core (open source) will be used — no dbt Cloud required</w:t>
+            <w:proofErr w:type="spellStart"/>
+            <w:r>
+              <w:rPr>
+                <w:sz w:val="20"/>
+                <w:szCs w:val="20"/>
+              </w:rPr>
+              <w:t>dbt</w:t>
+            </w:r>
+            <w:proofErr w:type="spellEnd"/>
+            <w:r>
+              <w:rPr>
+                <w:sz w:val="20"/>
+                <w:szCs w:val="20"/>
+              </w:rPr>
+              <w:t xml:space="preserve"> Core (open source) will be used — no </w:t>
+            </w:r>
+            <w:proofErr w:type="spellStart"/>
+            <w:r>
+              <w:rPr>
+                <w:sz w:val="20"/>
+                <w:szCs w:val="20"/>
+              </w:rPr>
+              <w:t>dbt</w:t>
+            </w:r>
+            <w:proofErr w:type="spellEnd"/>
+            <w:r>
+              <w:rPr>
+                <w:sz w:val="20"/>
+                <w:szCs w:val="20"/>
+              </w:rPr>
+              <w:t xml:space="preserve"> Cloud required</w:t>
             </w:r>
           </w:p>
         </w:tc>
       </w:tr>
       <w:tr>
-        <w:tblPrEx>
-          <w:tblCellMar>
-            <w:top w:w="0" w:type="dxa"/>
-            <w:bottom w:w="0" w:type="dxa"/>
-          </w:tblCellMar>
-        </w:tblPrEx>
         <w:tc>
           <w:tcPr>
             <w:tcW w:w="1400" w:type="dxa"/>
@@ -8505,12 +8376,6 @@
         </w:tc>
       </w:tr>
       <w:tr>
-        <w:tblPrEx>
-          <w:tblCellMar>
-            <w:top w:w="0" w:type="dxa"/>
-            <w:bottom w:w="0" w:type="dxa"/>
-          </w:tblCellMar>
-        </w:tblPrEx>
         <w:tc>
           <w:tcPr>
             <w:tcW w:w="1400" w:type="dxa"/>
@@ -8564,18 +8429,28 @@
                 <w:sz w:val="20"/>
                 <w:szCs w:val="20"/>
               </w:rPr>
-              <w:t>Python 3.9+ with pandas, great_expectations, and pandas-profiling installed</w:t>
+              <w:t xml:space="preserve">Python 3.9+ with pandas, </w:t>
+            </w:r>
+            <w:proofErr w:type="spellStart"/>
+            <w:r>
+              <w:rPr>
+                <w:sz w:val="20"/>
+                <w:szCs w:val="20"/>
+              </w:rPr>
+              <w:t>great_expectations</w:t>
+            </w:r>
+            <w:proofErr w:type="spellEnd"/>
+            <w:r>
+              <w:rPr>
+                <w:sz w:val="20"/>
+                <w:szCs w:val="20"/>
+              </w:rPr>
+              <w:t>, and pandas-profiling installed</w:t>
             </w:r>
           </w:p>
         </w:tc>
       </w:tr>
       <w:tr>
-        <w:tblPrEx>
-          <w:tblCellMar>
-            <w:top w:w="0" w:type="dxa"/>
-            <w:bottom w:w="0" w:type="dxa"/>
-          </w:tblCellMar>
-        </w:tblPrEx>
         <w:tc>
           <w:tcPr>
             <w:tcW w:w="1400" w:type="dxa"/>
@@ -8635,12 +8510,6 @@
         </w:tc>
       </w:tr>
       <w:tr>
-        <w:tblPrEx>
-          <w:tblCellMar>
-            <w:top w:w="0" w:type="dxa"/>
-            <w:bottom w:w="0" w:type="dxa"/>
-          </w:tblCellMar>
-        </w:tblPrEx>
         <w:tc>
           <w:tcPr>
             <w:tcW w:w="1400" w:type="dxa"/>
@@ -8735,12 +8604,6 @@
         <w:gridCol w:w="1760"/>
       </w:tblGrid>
       <w:tr>
-        <w:tblPrEx>
-          <w:tblCellMar>
-            <w:top w:w="0" w:type="dxa"/>
-            <w:bottom w:w="0" w:type="dxa"/>
-          </w:tblCellMar>
-        </w:tblPrEx>
         <w:tc>
           <w:tcPr>
             <w:tcW w:w="2600" w:type="dxa"/>
@@ -8867,12 +8730,6 @@
         </w:tc>
       </w:tr>
       <w:tr>
-        <w:tblPrEx>
-          <w:tblCellMar>
-            <w:top w:w="0" w:type="dxa"/>
-            <w:bottom w:w="0" w:type="dxa"/>
-          </w:tblCellMar>
-        </w:tblPrEx>
         <w:tc>
           <w:tcPr>
             <w:tcW w:w="2600" w:type="dxa"/>
@@ -8990,12 +8847,6 @@
         </w:tc>
       </w:tr>
       <w:tr>
-        <w:tblPrEx>
-          <w:tblCellMar>
-            <w:top w:w="0" w:type="dxa"/>
-            <w:bottom w:w="0" w:type="dxa"/>
-          </w:tblCellMar>
-        </w:tblPrEx>
         <w:tc>
           <w:tcPr>
             <w:tcW w:w="2600" w:type="dxa"/>
@@ -9113,12 +8964,6 @@
         </w:tc>
       </w:tr>
       <w:tr>
-        <w:tblPrEx>
-          <w:tblCellMar>
-            <w:top w:w="0" w:type="dxa"/>
-            <w:bottom w:w="0" w:type="dxa"/>
-          </w:tblCellMar>
-        </w:tblPrEx>
         <w:tc>
           <w:tcPr>
             <w:tcW w:w="2600" w:type="dxa"/>
@@ -9236,12 +9081,6 @@
         </w:tc>
       </w:tr>
       <w:tr>
-        <w:tblPrEx>
-          <w:tblCellMar>
-            <w:top w:w="0" w:type="dxa"/>
-            <w:bottom w:w="0" w:type="dxa"/>
-          </w:tblCellMar>
-        </w:tblPrEx>
         <w:tc>
           <w:tcPr>
             <w:tcW w:w="2600" w:type="dxa"/>
@@ -9359,12 +9198,6 @@
         </w:tc>
       </w:tr>
       <w:tr>
-        <w:tblPrEx>
-          <w:tblCellMar>
-            <w:top w:w="0" w:type="dxa"/>
-            <w:bottom w:w="0" w:type="dxa"/>
-          </w:tblCellMar>
-        </w:tblPrEx>
         <w:tc>
           <w:tcPr>
             <w:tcW w:w="2600" w:type="dxa"/>
@@ -9482,12 +9315,6 @@
         </w:tc>
       </w:tr>
       <w:tr>
-        <w:tblPrEx>
-          <w:tblCellMar>
-            <w:top w:w="0" w:type="dxa"/>
-            <w:bottom w:w="0" w:type="dxa"/>
-          </w:tblCellMar>
-        </w:tblPrEx>
         <w:tc>
           <w:tcPr>
             <w:tcW w:w="2600" w:type="dxa"/>
@@ -9541,7 +9368,23 @@
                 <w:sz w:val="20"/>
                 <w:szCs w:val="20"/>
               </w:rPr>
-              <w:t>ETL re-runs produce identical Gold output (idempotency)</w:t>
+              <w:t xml:space="preserve">ETL re-runs produce identical </w:t>
+            </w:r>
+            <w:proofErr w:type="gramStart"/>
+            <w:r>
+              <w:rPr>
+                <w:sz w:val="20"/>
+                <w:szCs w:val="20"/>
+              </w:rPr>
+              <w:t>Gold</w:t>
+            </w:r>
+            <w:proofErr w:type="gramEnd"/>
+            <w:r>
+              <w:rPr>
+                <w:sz w:val="20"/>
+                <w:szCs w:val="20"/>
+              </w:rPr>
+              <w:t xml:space="preserve"> output (idempotency)</w:t>
             </w:r>
           </w:p>
         </w:tc>
@@ -9605,12 +9448,6 @@
         </w:tc>
       </w:tr>
       <w:tr>
-        <w:tblPrEx>
-          <w:tblCellMar>
-            <w:top w:w="0" w:type="dxa"/>
-            <w:bottom w:w="0" w:type="dxa"/>
-          </w:tblCellMar>
-        </w:tblPrEx>
         <w:tc>
           <w:tcPr>
             <w:tcW w:w="2600" w:type="dxa"/>
@@ -9728,12 +9565,6 @@
         </w:tc>
       </w:tr>
       <w:tr>
-        <w:tblPrEx>
-          <w:tblCellMar>
-            <w:top w:w="0" w:type="dxa"/>
-            <w:bottom w:w="0" w:type="dxa"/>
-          </w:tblCellMar>
-        </w:tblPrEx>
         <w:tc>
           <w:tcPr>
             <w:tcW w:w="2600" w:type="dxa"/>
@@ -9760,7 +9591,6 @@
                 <w:sz w:val="20"/>
                 <w:szCs w:val="20"/>
               </w:rPr>
-              <w:lastRenderedPageBreak/>
               <w:t>CI/CD</w:t>
             </w:r>
           </w:p>
@@ -9788,7 +9618,23 @@
                 <w:sz w:val="20"/>
                 <w:szCs w:val="20"/>
               </w:rPr>
-              <w:t>All dbt and GE tests run automatically on PR to main branch</w:t>
+              <w:t xml:space="preserve">All </w:t>
+            </w:r>
+            <w:proofErr w:type="spellStart"/>
+            <w:r>
+              <w:rPr>
+                <w:sz w:val="20"/>
+                <w:szCs w:val="20"/>
+              </w:rPr>
+              <w:t>dbt</w:t>
+            </w:r>
+            <w:proofErr w:type="spellEnd"/>
+            <w:r>
+              <w:rPr>
+                <w:sz w:val="20"/>
+                <w:szCs w:val="20"/>
+              </w:rPr>
+              <w:t xml:space="preserve"> and GE tests run automatically on PR to main branch</w:t>
             </w:r>
           </w:p>
         </w:tc>
@@ -9860,6 +9706,7 @@
         </w:pBdr>
       </w:pPr>
       <w:r>
+        <w:lastRenderedPageBreak/>
         <w:t>10. Risks &amp; Mitigations</w:t>
       </w:r>
     </w:p>
@@ -9887,12 +9734,6 @@
         <w:gridCol w:w="3760"/>
       </w:tblGrid>
       <w:tr>
-        <w:tblPrEx>
-          <w:tblCellMar>
-            <w:top w:w="0" w:type="dxa"/>
-            <w:bottom w:w="0" w:type="dxa"/>
-          </w:tblCellMar>
-        </w:tblPrEx>
         <w:tc>
           <w:tcPr>
             <w:tcW w:w="2800" w:type="dxa"/>
@@ -10019,12 +9860,6 @@
         </w:tc>
       </w:tr>
       <w:tr>
-        <w:tblPrEx>
-          <w:tblCellMar>
-            <w:top w:w="0" w:type="dxa"/>
-            <w:bottom w:w="0" w:type="dxa"/>
-          </w:tblCellMar>
-        </w:tblPrEx>
         <w:tc>
           <w:tcPr>
             <w:tcW w:w="2800" w:type="dxa"/>
@@ -10135,18 +9970,44 @@
                 <w:sz w:val="20"/>
                 <w:szCs w:val="20"/>
               </w:rPr>
-              <w:t>Data profiling in Bronze layer to identify issues early; DQ checks in Silver block bad data from reaching Gold</w:t>
+              <w:t xml:space="preserve">Data profiling in </w:t>
+            </w:r>
+            <w:proofErr w:type="gramStart"/>
+            <w:r>
+              <w:rPr>
+                <w:sz w:val="20"/>
+                <w:szCs w:val="20"/>
+              </w:rPr>
+              <w:t>Bronze</w:t>
+            </w:r>
+            <w:proofErr w:type="gramEnd"/>
+            <w:r>
+              <w:rPr>
+                <w:sz w:val="20"/>
+                <w:szCs w:val="20"/>
+              </w:rPr>
+              <w:t xml:space="preserve"> layer to identify issues early; DQ checks in </w:t>
+            </w:r>
+            <w:proofErr w:type="gramStart"/>
+            <w:r>
+              <w:rPr>
+                <w:sz w:val="20"/>
+                <w:szCs w:val="20"/>
+              </w:rPr>
+              <w:t>Silver</w:t>
+            </w:r>
+            <w:proofErr w:type="gramEnd"/>
+            <w:r>
+              <w:rPr>
+                <w:sz w:val="20"/>
+                <w:szCs w:val="20"/>
+              </w:rPr>
+              <w:t xml:space="preserve"> block bad data from reaching Gold</w:t>
             </w:r>
           </w:p>
         </w:tc>
       </w:tr>
       <w:tr>
-        <w:tblPrEx>
-          <w:tblCellMar>
-            <w:top w:w="0" w:type="dxa"/>
-            <w:bottom w:w="0" w:type="dxa"/>
-          </w:tblCellMar>
-        </w:tblPrEx>
         <w:tc>
           <w:tcPr>
             <w:tcW w:w="2800" w:type="dxa"/>
@@ -10165,12 +10026,21 @@
             </w:tcMar>
           </w:tcPr>
           <w:p>
-            <w:r>
-              <w:rPr>
-                <w:sz w:val="20"/>
-                <w:szCs w:val="20"/>
-              </w:rPr>
-              <w:t>dbt learning curve causes delays</w:t>
+            <w:proofErr w:type="spellStart"/>
+            <w:r>
+              <w:rPr>
+                <w:sz w:val="20"/>
+                <w:szCs w:val="20"/>
+              </w:rPr>
+              <w:t>dbt</w:t>
+            </w:r>
+            <w:proofErr w:type="spellEnd"/>
+            <w:r>
+              <w:rPr>
+                <w:sz w:val="20"/>
+                <w:szCs w:val="20"/>
+              </w:rPr>
+              <w:t xml:space="preserve"> learning curve causes delays</w:t>
             </w:r>
           </w:p>
         </w:tc>
@@ -10257,18 +10127,28 @@
                 <w:sz w:val="20"/>
                 <w:szCs w:val="20"/>
               </w:rPr>
-              <w:t>Allocate dedicated spike sprint; use dbt getting-started guide; limit to Core features initially</w:t>
+              <w:t xml:space="preserve">Allocate dedicated spike sprint; use </w:t>
+            </w:r>
+            <w:proofErr w:type="spellStart"/>
+            <w:r>
+              <w:rPr>
+                <w:sz w:val="20"/>
+                <w:szCs w:val="20"/>
+              </w:rPr>
+              <w:t>dbt</w:t>
+            </w:r>
+            <w:proofErr w:type="spellEnd"/>
+            <w:r>
+              <w:rPr>
+                <w:sz w:val="20"/>
+                <w:szCs w:val="20"/>
+              </w:rPr>
+              <w:t xml:space="preserve"> getting-started guide; limit to Core features initially</w:t>
             </w:r>
           </w:p>
         </w:tc>
       </w:tr>
       <w:tr>
-        <w:tblPrEx>
-          <w:tblCellMar>
-            <w:top w:w="0" w:type="dxa"/>
-            <w:bottom w:w="0" w:type="dxa"/>
-          </w:tblCellMar>
-        </w:tblPrEx>
         <w:tc>
           <w:tcPr>
             <w:tcW w:w="2800" w:type="dxa"/>
@@ -10298,7 +10178,43 @@
                 <w:szCs w:val="20"/>
                 <w:lang w:val="fr-FR"/>
               </w:rPr>
-              <w:t>SCD Type 2 logic errors cause duplicate records</w:t>
+              <w:t xml:space="preserve">SCD Type 2 </w:t>
+            </w:r>
+            <w:proofErr w:type="spellStart"/>
+            <w:r>
+              <w:rPr>
+                <w:sz w:val="20"/>
+                <w:szCs w:val="20"/>
+                <w:lang w:val="fr-FR"/>
+              </w:rPr>
+              <w:t>logic</w:t>
+            </w:r>
+            <w:proofErr w:type="spellEnd"/>
+            <w:r>
+              <w:rPr>
+                <w:sz w:val="20"/>
+                <w:szCs w:val="20"/>
+                <w:lang w:val="fr-FR"/>
+              </w:rPr>
+              <w:t xml:space="preserve"> </w:t>
+            </w:r>
+            <w:proofErr w:type="spellStart"/>
+            <w:r>
+              <w:rPr>
+                <w:sz w:val="20"/>
+                <w:szCs w:val="20"/>
+                <w:lang w:val="fr-FR"/>
+              </w:rPr>
+              <w:t>errors</w:t>
+            </w:r>
+            <w:proofErr w:type="spellEnd"/>
+            <w:r>
+              <w:rPr>
+                <w:sz w:val="20"/>
+                <w:szCs w:val="20"/>
+                <w:lang w:val="fr-FR"/>
+              </w:rPr>
+              <w:t xml:space="preserve"> cause duplicate records</w:t>
             </w:r>
           </w:p>
         </w:tc>
@@ -10391,12 +10307,6 @@
         </w:tc>
       </w:tr>
       <w:tr>
-        <w:tblPrEx>
-          <w:tblCellMar>
-            <w:top w:w="0" w:type="dxa"/>
-            <w:bottom w:w="0" w:type="dxa"/>
-          </w:tblCellMar>
-        </w:tblPrEx>
         <w:tc>
           <w:tcPr>
             <w:tcW w:w="2800" w:type="dxa"/>
@@ -10513,12 +10423,6 @@
         </w:tc>
       </w:tr>
       <w:tr>
-        <w:tblPrEx>
-          <w:tblCellMar>
-            <w:top w:w="0" w:type="dxa"/>
-            <w:bottom w:w="0" w:type="dxa"/>
-          </w:tblCellMar>
-        </w:tblPrEx>
         <w:tc>
           <w:tcPr>
             <w:tcW w:w="2800" w:type="dxa"/>
@@ -10548,8 +10452,18 @@
                 <w:szCs w:val="20"/>
                 <w:lang w:val="fr-FR"/>
               </w:rPr>
-              <w:t>GitHub Actions CI/CD misconfiguration</w:t>
-            </w:r>
+              <w:t xml:space="preserve">GitHub Actions CI/CD </w:t>
+            </w:r>
+            <w:proofErr w:type="spellStart"/>
+            <w:r>
+              <w:rPr>
+                <w:sz w:val="20"/>
+                <w:szCs w:val="20"/>
+                <w:lang w:val="fr-FR"/>
+              </w:rPr>
+              <w:t>misconfiguration</w:t>
+            </w:r>
+            <w:proofErr w:type="spellEnd"/>
           </w:p>
         </w:tc>
         <w:tc>
@@ -10635,7 +10549,23 @@
                 <w:sz w:val="20"/>
                 <w:szCs w:val="20"/>
               </w:rPr>
-              <w:t>Start with simple dbt test workflow; expand incrementally; test in a feature branch first</w:t>
+              <w:t xml:space="preserve">Start with simple </w:t>
+            </w:r>
+            <w:proofErr w:type="spellStart"/>
+            <w:r>
+              <w:rPr>
+                <w:sz w:val="20"/>
+                <w:szCs w:val="20"/>
+              </w:rPr>
+              <w:t>dbt</w:t>
+            </w:r>
+            <w:proofErr w:type="spellEnd"/>
+            <w:r>
+              <w:rPr>
+                <w:sz w:val="20"/>
+                <w:szCs w:val="20"/>
+              </w:rPr>
+              <w:t xml:space="preserve"> test workflow; expand incrementally; test in a feature branch first</w:t>
             </w:r>
           </w:p>
         </w:tc>
@@ -10676,12 +10606,6 @@
         <w:gridCol w:w="5360"/>
       </w:tblGrid>
       <w:tr>
-        <w:tblPrEx>
-          <w:tblCellMar>
-            <w:top w:w="0" w:type="dxa"/>
-            <w:bottom w:w="0" w:type="dxa"/>
-          </w:tblCellMar>
-        </w:tblPrEx>
         <w:tc>
           <w:tcPr>
             <w:tcW w:w="400" w:type="dxa"/>
@@ -10808,12 +10732,6 @@
         </w:tc>
       </w:tr>
       <w:tr>
-        <w:tblPrEx>
-          <w:tblCellMar>
-            <w:top w:w="0" w:type="dxa"/>
-            <w:bottom w:w="0" w:type="dxa"/>
-          </w:tblCellMar>
-        </w:tblPrEx>
         <w:tc>
           <w:tcPr>
             <w:tcW w:w="400" w:type="dxa"/>
@@ -10925,18 +10843,28 @@
                 <w:sz w:val="20"/>
                 <w:szCs w:val="20"/>
               </w:rPr>
-              <w:t>BRD (this doc), GitHub repo setup, DrawIO architecture diagrams, backlog creation in GitHub Projects</w:t>
+              <w:t xml:space="preserve">BRD (this doc), GitHub repo setup, </w:t>
+            </w:r>
+            <w:proofErr w:type="spellStart"/>
+            <w:r>
+              <w:rPr>
+                <w:sz w:val="20"/>
+                <w:szCs w:val="20"/>
+              </w:rPr>
+              <w:t>DrawIO</w:t>
+            </w:r>
+            <w:proofErr w:type="spellEnd"/>
+            <w:r>
+              <w:rPr>
+                <w:sz w:val="20"/>
+                <w:szCs w:val="20"/>
+              </w:rPr>
+              <w:t xml:space="preserve"> architecture diagrams, backlog creation in GitHub Projects</w:t>
             </w:r>
           </w:p>
         </w:tc>
       </w:tr>
       <w:tr>
-        <w:tblPrEx>
-          <w:tblCellMar>
-            <w:top w:w="0" w:type="dxa"/>
-            <w:bottom w:w="0" w:type="dxa"/>
-          </w:tblCellMar>
-        </w:tblPrEx>
         <w:tc>
           <w:tcPr>
             <w:tcW w:w="400" w:type="dxa"/>
@@ -11054,12 +10982,6 @@
         </w:tc>
       </w:tr>
       <w:tr>
-        <w:tblPrEx>
-          <w:tblCellMar>
-            <w:top w:w="0" w:type="dxa"/>
-            <w:bottom w:w="0" w:type="dxa"/>
-          </w:tblCellMar>
-        </w:tblPrEx>
         <w:tc>
           <w:tcPr>
             <w:tcW w:w="400" w:type="dxa"/>
@@ -11166,23 +11088,58 @@
             </w:tcMar>
           </w:tcPr>
           <w:p>
-            <w:r>
-              <w:rPr>
-                <w:sz w:val="20"/>
-                <w:szCs w:val="20"/>
-              </w:rPr>
-              <w:t>dbt Silver models, Great Expectations test suite, DQ metrics table, Silver schema documentation</w:t>
+            <w:proofErr w:type="spellStart"/>
+            <w:r>
+              <w:rPr>
+                <w:sz w:val="20"/>
+                <w:szCs w:val="20"/>
+              </w:rPr>
+              <w:t>dbt</w:t>
+            </w:r>
+            <w:proofErr w:type="spellEnd"/>
+            <w:r>
+              <w:rPr>
+                <w:sz w:val="20"/>
+                <w:szCs w:val="20"/>
+              </w:rPr>
+              <w:t xml:space="preserve"> </w:t>
+            </w:r>
+            <w:proofErr w:type="gramStart"/>
+            <w:r>
+              <w:rPr>
+                <w:sz w:val="20"/>
+                <w:szCs w:val="20"/>
+              </w:rPr>
+              <w:t>Silver</w:t>
+            </w:r>
+            <w:proofErr w:type="gramEnd"/>
+            <w:r>
+              <w:rPr>
+                <w:sz w:val="20"/>
+                <w:szCs w:val="20"/>
+              </w:rPr>
+              <w:t xml:space="preserve"> models, Great Expectations test suite, DQ metrics table, </w:t>
+            </w:r>
+            <w:proofErr w:type="gramStart"/>
+            <w:r>
+              <w:rPr>
+                <w:sz w:val="20"/>
+                <w:szCs w:val="20"/>
+              </w:rPr>
+              <w:t>Silver</w:t>
+            </w:r>
+            <w:proofErr w:type="gramEnd"/>
+            <w:r>
+              <w:rPr>
+                <w:sz w:val="20"/>
+                <w:szCs w:val="20"/>
+              </w:rPr>
+              <w:t xml:space="preserve"> schema documentation</w:t>
             </w:r>
           </w:p>
         </w:tc>
       </w:tr>
       <w:tr>
-        <w:tblPrEx>
-          <w:tblCellMar>
-            <w:top w:w="0" w:type="dxa"/>
-            <w:bottom w:w="0" w:type="dxa"/>
-          </w:tblCellMar>
-        </w:tblPrEx>
         <w:tc>
           <w:tcPr>
             <w:tcW w:w="400" w:type="dxa"/>
@@ -11294,18 +11251,28 @@
                 <w:sz w:val="20"/>
                 <w:szCs w:val="20"/>
               </w:rPr>
-              <w:t>Star schema build, SCD Type 2 on Customer &amp; Product dims, KPI views, Gold data catalog</w:t>
+              <w:t xml:space="preserve">Star schema build, SCD Type 2 on Customer &amp; Product dims, KPI views, </w:t>
+            </w:r>
+            <w:proofErr w:type="gramStart"/>
+            <w:r>
+              <w:rPr>
+                <w:sz w:val="20"/>
+                <w:szCs w:val="20"/>
+              </w:rPr>
+              <w:t>Gold</w:t>
+            </w:r>
+            <w:proofErr w:type="gramEnd"/>
+            <w:r>
+              <w:rPr>
+                <w:sz w:val="20"/>
+                <w:szCs w:val="20"/>
+              </w:rPr>
+              <w:t xml:space="preserve"> data catalog</w:t>
             </w:r>
           </w:p>
         </w:tc>
       </w:tr>
       <w:tr>
-        <w:tblPrEx>
-          <w:tblCellMar>
-            <w:top w:w="0" w:type="dxa"/>
-            <w:bottom w:w="0" w:type="dxa"/>
-          </w:tblCellMar>
-        </w:tblPrEx>
         <w:tc>
           <w:tcPr>
             <w:tcW w:w="400" w:type="dxa"/>
@@ -11417,18 +11384,28 @@
                 <w:sz w:val="20"/>
                 <w:szCs w:val="20"/>
               </w:rPr>
-              <w:t>8 SQL analytical reports, Power BI / Streamlit dashboard (3–5 pages), executive summary view</w:t>
+              <w:t xml:space="preserve">8 SQL analytical reports, Power BI / </w:t>
+            </w:r>
+            <w:proofErr w:type="spellStart"/>
+            <w:r>
+              <w:rPr>
+                <w:sz w:val="20"/>
+                <w:szCs w:val="20"/>
+              </w:rPr>
+              <w:t>Streamlit</w:t>
+            </w:r>
+            <w:proofErr w:type="spellEnd"/>
+            <w:r>
+              <w:rPr>
+                <w:sz w:val="20"/>
+                <w:szCs w:val="20"/>
+              </w:rPr>
+              <w:t xml:space="preserve"> dashboard (3–5 pages), executive summary view</w:t>
             </w:r>
           </w:p>
         </w:tc>
       </w:tr>
       <w:tr>
-        <w:tblPrEx>
-          <w:tblCellMar>
-            <w:top w:w="0" w:type="dxa"/>
-            <w:bottom w:w="0" w:type="dxa"/>
-          </w:tblCellMar>
-        </w:tblPrEx>
         <w:tc>
           <w:tcPr>
             <w:tcW w:w="400" w:type="dxa"/>
@@ -11594,12 +11571,6 @@
         <w:gridCol w:w="2160"/>
       </w:tblGrid>
       <w:tr>
-        <w:tblPrEx>
-          <w:tblCellMar>
-            <w:top w:w="0" w:type="dxa"/>
-            <w:bottom w:w="0" w:type="dxa"/>
-          </w:tblCellMar>
-        </w:tblPrEx>
         <w:tc>
           <w:tcPr>
             <w:tcW w:w="2800" w:type="dxa"/>
@@ -11726,12 +11697,6 @@
         </w:tc>
       </w:tr>
       <w:tr>
-        <w:tblPrEx>
-          <w:tblCellMar>
-            <w:top w:w="0" w:type="dxa"/>
-            <w:bottom w:w="0" w:type="dxa"/>
-          </w:tblCellMar>
-        </w:tblPrEx>
         <w:tc>
           <w:tcPr>
             <w:tcW w:w="2800" w:type="dxa"/>
@@ -11818,12 +11783,6 @@
         </w:tc>
       </w:tr>
       <w:tr>
-        <w:tblPrEx>
-          <w:tblCellMar>
-            <w:top w:w="0" w:type="dxa"/>
-            <w:bottom w:w="0" w:type="dxa"/>
-          </w:tblCellMar>
-        </w:tblPrEx>
         <w:tc>
           <w:tcPr>
             <w:tcW w:w="2800" w:type="dxa"/>
@@ -11910,12 +11869,6 @@
         </w:tc>
       </w:tr>
       <w:tr>
-        <w:tblPrEx>
-          <w:tblCellMar>
-            <w:top w:w="0" w:type="dxa"/>
-            <w:bottom w:w="0" w:type="dxa"/>
-          </w:tblCellMar>
-        </w:tblPrEx>
         <w:tc>
           <w:tcPr>
             <w:tcW w:w="2800" w:type="dxa"/>
@@ -12844,6 +12797,7 @@
   <w:style w:type="character" w:default="1" w:styleId="DefaultParagraphFont">
     <w:name w:val="Default Paragraph Font"/>
     <w:uiPriority w:val="1"/>
+    <w:semiHidden/>
     <w:unhideWhenUsed/>
   </w:style>
   <w:style w:type="table" w:default="1" w:styleId="TableNormal">

</xml_diff>